<commit_message>
Añadidos contenidos en gallego.
</commit_message>
<xml_diff>
--- a/build/gal_electric_circuits.docx
+++ b/build/gal_electric_circuits.docx
@@ -7,7 +7,7 @@
         <w:pStyle w:val="Heading1"/>
       </w:pPr>
       <w:r>
-        <w:t>Electricity. Circuitos.</w:t>
+        <w:t>Electricity. Circuítos.</w:t>
       </w:r>
     </w:p>
     <w:p>
@@ -35,65 +35,65 @@
       <w:r>
         <w:t>b)</w:t>
         <w:tab/>
+        <w:t>Sempre produce calor.</w:t>
+      </w:r>
+    </w:p>
+    <w:p>
+      <w:pPr>
+        <w:pStyle w:val="Choice"/>
+      </w:pPr>
+      <w:r>
+        <w:t>c)</w:t>
+        <w:tab/>
+        <w:t>Sempre ten que haber un elemento que forneza enerxía eléctrica.</w:t>
+      </w:r>
+    </w:p>
+    <w:p>
+      <w:pPr>
+        <w:pStyle w:val="Choice"/>
+      </w:pPr>
+      <w:r>
+        <w:t>d)</w:t>
+        <w:tab/>
         <w:t>Se produce sempre que hai unha corrente eléctrica.</w:t>
       </w:r>
     </w:p>
     <w:p>
       <w:pPr>
+        <w:pStyle w:val="ListNumber"/>
+      </w:pPr>
+      <w:r>
+        <w:t>Cales son os tipos de elementos que podo atopar nun circuíto eléctrico?</w:t>
+      </w:r>
+    </w:p>
+    <w:p>
+      <w:pPr>
+        <w:pStyle w:val="Choice"/>
+      </w:pPr>
+      <w:r>
+        <w:t>a)</w:t>
+        <w:tab/>
+        <w:t>Xeradores, cables, interruptores e conmutadores</w:t>
+      </w:r>
+    </w:p>
+    <w:p>
+      <w:pPr>
+        <w:pStyle w:val="Choice"/>
+      </w:pPr>
+      <w:r>
+        <w:t>b)</w:t>
+        <w:tab/>
+        <w:t>Pilas, cables, resistencias e interruptores</w:t>
+      </w:r>
+    </w:p>
+    <w:p>
+      <w:pPr>
         <w:pStyle w:val="Choice"/>
       </w:pPr>
       <w:r>
         <w:t>c)</w:t>
         <w:tab/>
-        <w:t>Sempre ten que haber un elemento que forneza enerxía eléctrica.</w:t>
-      </w:r>
-    </w:p>
-    <w:p>
-      <w:pPr>
-        <w:pStyle w:val="Choice"/>
-      </w:pPr>
-      <w:r>
-        <w:t>d)</w:t>
-        <w:tab/>
-        <w:t>Sempre produce calor.</w:t>
-      </w:r>
-    </w:p>
-    <w:p>
-      <w:pPr>
-        <w:pStyle w:val="ListNumber"/>
-      </w:pPr>
-      <w:r>
-        <w:t>Cales son os tipos de elementos que podo atopar nun circuíto eléctrico?</w:t>
-      </w:r>
-    </w:p>
-    <w:p>
-      <w:pPr>
-        <w:pStyle w:val="Choice"/>
-      </w:pPr>
-      <w:r>
-        <w:t>a)</w:t>
-        <w:tab/>
-        <w:t>Pilas, cables, resistencias e interruptores</w:t>
-      </w:r>
-    </w:p>
-    <w:p>
-      <w:pPr>
-        <w:pStyle w:val="Choice"/>
-      </w:pPr>
-      <w:r>
-        <w:t>b)</w:t>
-        <w:tab/>
         <w:t>Xeradores, condutores, receptores e elementos de control</w:t>
-      </w:r>
-    </w:p>
-    <w:p>
-      <w:pPr>
-        <w:pStyle w:val="Choice"/>
-      </w:pPr>
-      <w:r>
-        <w:t>c)</w:t>
-        <w:tab/>
-        <w:t>Xeradores, cables, interruptores e conmutadores</w:t>
       </w:r>
     </w:p>
     <w:p>
@@ -247,17 +247,65 @@
       <w:r>
         <w:t>a)</w:t>
         <w:tab/>
+        <w:t>8Ω</w:t>
+      </w:r>
+    </w:p>
+    <w:p>
+      <w:pPr>
+        <w:pStyle w:val="Choice"/>
+      </w:pPr>
+      <w:r>
+        <w:t>b)</w:t>
+        <w:tab/>
+        <w:t>3Ω</w:t>
+      </w:r>
+    </w:p>
+    <w:p>
+      <w:pPr>
+        <w:pStyle w:val="Choice"/>
+      </w:pPr>
+      <w:r>
+        <w:t>c)</w:t>
+        <w:tab/>
+        <w:t>2Ω</w:t>
+      </w:r>
+    </w:p>
+    <w:p>
+      <w:pPr>
+        <w:pStyle w:val="Choice"/>
+      </w:pPr>
+      <w:r>
+        <w:t>d)</w:t>
+        <w:tab/>
         <w:t>4Ω</w:t>
       </w:r>
     </w:p>
     <w:p>
       <w:pPr>
+        <w:pStyle w:val="ListNumber"/>
+      </w:pPr>
+      <w:r>
+        <w:t>Como se chaman os elementos dun circuíto que fornecen os electróns?</w:t>
+      </w:r>
+    </w:p>
+    <w:p>
+      <w:pPr>
+        <w:pStyle w:val="Choice"/>
+      </w:pPr>
+      <w:r>
+        <w:t>a)</w:t>
+        <w:tab/>
+        <w:t>Condutores</w:t>
+      </w:r>
+    </w:p>
+    <w:p>
+      <w:pPr>
         <w:pStyle w:val="Choice"/>
       </w:pPr>
       <w:r>
         <w:t>b)</w:t>
         <w:tab/>
-        <w:t>2Ω</w:t>
+        <w:t>Xeradores</w:t>
       </w:r>
     </w:p>
     <w:p>
@@ -267,7 +315,7 @@
       <w:r>
         <w:t>c)</w:t>
         <w:tab/>
-        <w:t>8Ω</w:t>
+        <w:t>Elementos de control</w:t>
       </w:r>
     </w:p>
     <w:p>
@@ -277,7 +325,7 @@
       <w:r>
         <w:t>d)</w:t>
         <w:tab/>
-        <w:t>3Ω</w:t>
+        <w:t>Receptores</w:t>
       </w:r>
     </w:p>
     <w:p>
@@ -285,7 +333,7 @@
         <w:pStyle w:val="ListNumber"/>
       </w:pPr>
       <w:r>
-        <w:t>Como se chaman os elementos dun circuíto que fornecen os electróns?</w:t>
+        <w:t>Como se chaman os elementos dun circuíto que transforman a electricidade noutro tipo de enerxía?</w:t>
       </w:r>
     </w:p>
     <w:p>
@@ -295,6 +343,16 @@
       <w:r>
         <w:t>a)</w:t>
         <w:tab/>
+        <w:t>Receptores</w:t>
+      </w:r>
+    </w:p>
+    <w:p>
+      <w:pPr>
+        <w:pStyle w:val="Choice"/>
+      </w:pPr>
+      <w:r>
+        <w:t>b)</w:t>
+        <w:tab/>
         <w:t>Xeradores</w:t>
       </w:r>
     </w:p>
@@ -303,8 +361,56 @@
         <w:pStyle w:val="Choice"/>
       </w:pPr>
       <w:r>
+        <w:t>c)</w:t>
+        <w:tab/>
+        <w:t>Elementos de control</w:t>
+      </w:r>
+    </w:p>
+    <w:p>
+      <w:pPr>
+        <w:pStyle w:val="Choice"/>
+      </w:pPr>
+      <w:r>
+        <w:t>d)</w:t>
+        <w:tab/>
+        <w:t>Transformadores</w:t>
+      </w:r>
+    </w:p>
+    <w:p>
+      <w:pPr>
+        <w:pStyle w:val="ListNumber"/>
+      </w:pPr>
+      <w:r>
+        <w:t>Como se chaman os elementos dun circuíto que permiten o paso da corrente entre un compoñente e outro?</w:t>
+      </w:r>
+    </w:p>
+    <w:p>
+      <w:pPr>
+        <w:pStyle w:val="Choice"/>
+      </w:pPr>
+      <w:r>
+        <w:t>a)</w:t>
+        <w:tab/>
+        <w:t>Xeradores</w:t>
+      </w:r>
+    </w:p>
+    <w:p>
+      <w:pPr>
+        <w:pStyle w:val="Choice"/>
+      </w:pPr>
+      <w:r>
         <w:t>b)</w:t>
         <w:tab/>
+        <w:t>Receptores</w:t>
+      </w:r>
+    </w:p>
+    <w:p>
+      <w:pPr>
+        <w:pStyle w:val="Choice"/>
+      </w:pPr>
+      <w:r>
+        <w:t>c)</w:t>
+        <w:tab/>
         <w:t>Elementos de control</w:t>
       </w:r>
     </w:p>
@@ -313,19 +419,105 @@
         <w:pStyle w:val="Choice"/>
       </w:pPr>
       <w:r>
+        <w:t>d)</w:t>
+        <w:tab/>
+        <w:t>Condutores</w:t>
+      </w:r>
+    </w:p>
+    <w:p>
+      <w:pPr>
+        <w:pStyle w:val="ListNumber"/>
+      </w:pPr>
+      <w:r>
+        <w:t>Como se chaman os elementos dun circuíto que nos permiten facer que a corrente circule por onde nós queremos?</w:t>
+      </w:r>
+    </w:p>
+    <w:p>
+      <w:pPr>
+        <w:pStyle w:val="Choice"/>
+      </w:pPr>
+      <w:r>
+        <w:t>a)</w:t>
+        <w:tab/>
+        <w:t>Xeradores</w:t>
+      </w:r>
+    </w:p>
+    <w:p>
+      <w:pPr>
+        <w:pStyle w:val="Choice"/>
+      </w:pPr>
+      <w:r>
+        <w:t>b)</w:t>
+        <w:tab/>
+        <w:t>Elementos de control</w:t>
+      </w:r>
+    </w:p>
+    <w:p>
+      <w:pPr>
+        <w:pStyle w:val="Choice"/>
+      </w:pPr>
+      <w:r>
         <w:t>c)</w:t>
         <w:tab/>
+        <w:t>Condutores</w:t>
+      </w:r>
+    </w:p>
+    <w:p>
+      <w:pPr>
+        <w:pStyle w:val="Choice"/>
+      </w:pPr>
+      <w:r>
+        <w:t>d)</w:t>
+        <w:tab/>
         <w:t>Receptores</w:t>
       </w:r>
     </w:p>
     <w:p>
       <w:pPr>
+        <w:pStyle w:val="ListNumber"/>
+      </w:pPr>
+      <w:r>
+        <w:t>Cal non é un xerador?</w:t>
+      </w:r>
+    </w:p>
+    <w:p>
+      <w:pPr>
+        <w:pStyle w:val="Choice"/>
+      </w:pPr>
+      <w:r>
+        <w:t>a)</w:t>
+        <w:tab/>
+        <w:t>Batería</w:t>
+      </w:r>
+    </w:p>
+    <w:p>
+      <w:pPr>
+        <w:pStyle w:val="Choice"/>
+      </w:pPr>
+      <w:r>
+        <w:t>b)</w:t>
+        <w:tab/>
+        <w:t>Pila</w:t>
+      </w:r>
+    </w:p>
+    <w:p>
+      <w:pPr>
+        <w:pStyle w:val="Choice"/>
+      </w:pPr>
+      <w:r>
+        <w:t>c)</w:t>
+        <w:tab/>
+        <w:t>Motor</w:t>
+      </w:r>
+    </w:p>
+    <w:p>
+      <w:pPr>
         <w:pStyle w:val="Choice"/>
       </w:pPr>
       <w:r>
         <w:t>d)</w:t>
         <w:tab/>
-        <w:t>Condutores</w:t>
+        <w:t>Toma de rede</w:t>
       </w:r>
     </w:p>
     <w:p>
@@ -333,7 +525,7 @@
         <w:pStyle w:val="ListNumber"/>
       </w:pPr>
       <w:r>
-        <w:t>Como se chaman os elementos dun circuíto que transforman a electricidade noutro tipo de enerxía?</w:t>
+        <w:t>Cal consideramos un condutor?</w:t>
       </w:r>
     </w:p>
     <w:p>
@@ -343,7 +535,7 @@
       <w:r>
         <w:t>a)</w:t>
         <w:tab/>
-        <w:t>Xeradores</w:t>
+        <w:t>Interruptor</w:t>
       </w:r>
     </w:p>
     <w:p>
@@ -353,7 +545,7 @@
       <w:r>
         <w:t>b)</w:t>
         <w:tab/>
-        <w:t>Elementos de control</w:t>
+        <w:t>Cable</w:t>
       </w:r>
     </w:p>
     <w:p>
@@ -363,7 +555,7 @@
       <w:r>
         <w:t>c)</w:t>
         <w:tab/>
-        <w:t>Receptores</w:t>
+        <w:t>Aluminio</w:t>
       </w:r>
     </w:p>
     <w:p>
@@ -373,7 +565,7 @@
       <w:r>
         <w:t>d)</w:t>
         <w:tab/>
-        <w:t>Transformadores</w:t>
+        <w:t>Pulsador</w:t>
       </w:r>
     </w:p>
     <w:p>
@@ -381,7 +573,7 @@
         <w:pStyle w:val="ListNumber"/>
       </w:pPr>
       <w:r>
-        <w:t>Como se chaman os elementos dun circuíto que permiten o paso da corrente entre un compoñente e outro?</w:t>
+        <w:t>Cal non sería un receptor?</w:t>
       </w:r>
     </w:p>
     <w:p>
@@ -391,7 +583,7 @@
       <w:r>
         <w:t>a)</w:t>
         <w:tab/>
-        <w:t>Elementos de control</w:t>
+        <w:t>Lámpada</w:t>
       </w:r>
     </w:p>
     <w:p>
@@ -401,7 +593,7 @@
       <w:r>
         <w:t>b)</w:t>
         <w:tab/>
-        <w:t>Condutores</w:t>
+        <w:t>Resistencia</w:t>
       </w:r>
     </w:p>
     <w:p>
@@ -411,7 +603,7 @@
       <w:r>
         <w:t>c)</w:t>
         <w:tab/>
-        <w:t>Xeradores</w:t>
+        <w:t>Motor</w:t>
       </w:r>
     </w:p>
     <w:p>
@@ -421,7 +613,7 @@
       <w:r>
         <w:t>d)</w:t>
         <w:tab/>
-        <w:t>Receptores</w:t>
+        <w:t>Pila</w:t>
       </w:r>
     </w:p>
     <w:p>
@@ -429,7 +621,7 @@
         <w:pStyle w:val="ListNumber"/>
       </w:pPr>
       <w:r>
-        <w:t>Como se chaman os elementos dun circuíto que nos permiten facer que a corrente circule por onde nós queremos?</w:t>
+        <w:t>Cal non é un elemento de control?</w:t>
       </w:r>
     </w:p>
     <w:p>
@@ -439,7 +631,7 @@
       <w:r>
         <w:t>a)</w:t>
         <w:tab/>
-        <w:t>Condutores</w:t>
+        <w:t>Conmutador</w:t>
       </w:r>
     </w:p>
     <w:p>
@@ -449,7 +641,7 @@
       <w:r>
         <w:t>b)</w:t>
         <w:tab/>
-        <w:t>Xeradores</w:t>
+        <w:t>Interruptor</w:t>
       </w:r>
     </w:p>
     <w:p>
@@ -459,7 +651,7 @@
       <w:r>
         <w:t>c)</w:t>
         <w:tab/>
-        <w:t>Receptores</w:t>
+        <w:t>Cable</w:t>
       </w:r>
     </w:p>
     <w:p>
@@ -469,199 +661,7 @@
       <w:r>
         <w:t>d)</w:t>
         <w:tab/>
-        <w:t>Elementos de control</w:t>
-      </w:r>
-    </w:p>
-    <w:p>
-      <w:pPr>
-        <w:pStyle w:val="ListNumber"/>
-      </w:pPr>
-      <w:r>
-        <w:t>Cal non é un xerador?</w:t>
-      </w:r>
-    </w:p>
-    <w:p>
-      <w:pPr>
-        <w:pStyle w:val="Choice"/>
-      </w:pPr>
-      <w:r>
-        <w:t>a)</w:t>
-        <w:tab/>
-        <w:t>Toma de rede</w:t>
-      </w:r>
-    </w:p>
-    <w:p>
-      <w:pPr>
-        <w:pStyle w:val="Choice"/>
-      </w:pPr>
-      <w:r>
-        <w:t>b)</w:t>
-        <w:tab/>
-        <w:t>Pila</w:t>
-      </w:r>
-    </w:p>
-    <w:p>
-      <w:pPr>
-        <w:pStyle w:val="Choice"/>
-      </w:pPr>
-      <w:r>
-        <w:t>c)</w:t>
-        <w:tab/>
-        <w:t>Motor</w:t>
-      </w:r>
-    </w:p>
-    <w:p>
-      <w:pPr>
-        <w:pStyle w:val="Choice"/>
-      </w:pPr>
-      <w:r>
-        <w:t>d)</w:t>
-        <w:tab/>
-        <w:t>Batería</w:t>
-      </w:r>
-    </w:p>
-    <w:p>
-      <w:pPr>
-        <w:pStyle w:val="ListNumber"/>
-      </w:pPr>
-      <w:r>
-        <w:t>Cal consideramos un condutor?</w:t>
-      </w:r>
-    </w:p>
-    <w:p>
-      <w:pPr>
-        <w:pStyle w:val="Choice"/>
-      </w:pPr>
-      <w:r>
-        <w:t>a)</w:t>
-        <w:tab/>
-        <w:t>Aluminio</w:t>
-      </w:r>
-    </w:p>
-    <w:p>
-      <w:pPr>
-        <w:pStyle w:val="Choice"/>
-      </w:pPr>
-      <w:r>
-        <w:t>b)</w:t>
-        <w:tab/>
         <w:t>Pulsador</w:t>
-      </w:r>
-    </w:p>
-    <w:p>
-      <w:pPr>
-        <w:pStyle w:val="Choice"/>
-      </w:pPr>
-      <w:r>
-        <w:t>c)</w:t>
-        <w:tab/>
-        <w:t>Interruptor</w:t>
-      </w:r>
-    </w:p>
-    <w:p>
-      <w:pPr>
-        <w:pStyle w:val="Choice"/>
-      </w:pPr>
-      <w:r>
-        <w:t>d)</w:t>
-        <w:tab/>
-        <w:t>Cable</w:t>
-      </w:r>
-    </w:p>
-    <w:p>
-      <w:pPr>
-        <w:pStyle w:val="ListNumber"/>
-      </w:pPr>
-      <w:r>
-        <w:t>Cal non sería un receptor?</w:t>
-      </w:r>
-    </w:p>
-    <w:p>
-      <w:pPr>
-        <w:pStyle w:val="Choice"/>
-      </w:pPr>
-      <w:r>
-        <w:t>a)</w:t>
-        <w:tab/>
-        <w:t>Lámpada</w:t>
-      </w:r>
-    </w:p>
-    <w:p>
-      <w:pPr>
-        <w:pStyle w:val="Choice"/>
-      </w:pPr>
-      <w:r>
-        <w:t>b)</w:t>
-        <w:tab/>
-        <w:t>Motor</w:t>
-      </w:r>
-    </w:p>
-    <w:p>
-      <w:pPr>
-        <w:pStyle w:val="Choice"/>
-      </w:pPr>
-      <w:r>
-        <w:t>c)</w:t>
-        <w:tab/>
-        <w:t>Pila</w:t>
-      </w:r>
-    </w:p>
-    <w:p>
-      <w:pPr>
-        <w:pStyle w:val="Choice"/>
-      </w:pPr>
-      <w:r>
-        <w:t>d)</w:t>
-        <w:tab/>
-        <w:t>Resistencia</w:t>
-      </w:r>
-    </w:p>
-    <w:p>
-      <w:pPr>
-        <w:pStyle w:val="ListNumber"/>
-      </w:pPr>
-      <w:r>
-        <w:t>Cal non é un elemento de control?</w:t>
-      </w:r>
-    </w:p>
-    <w:p>
-      <w:pPr>
-        <w:pStyle w:val="Choice"/>
-      </w:pPr>
-      <w:r>
-        <w:t>a)</w:t>
-        <w:tab/>
-        <w:t>Pulsador</w:t>
-      </w:r>
-    </w:p>
-    <w:p>
-      <w:pPr>
-        <w:pStyle w:val="Choice"/>
-      </w:pPr>
-      <w:r>
-        <w:t>b)</w:t>
-        <w:tab/>
-        <w:t>Interruptor</w:t>
-      </w:r>
-    </w:p>
-    <w:p>
-      <w:pPr>
-        <w:pStyle w:val="Choice"/>
-      </w:pPr>
-      <w:r>
-        <w:t>c)</w:t>
-        <w:tab/>
-        <w:t>Conmutador</w:t>
-      </w:r>
-    </w:p>
-    <w:p>
-      <w:pPr>
-        <w:pStyle w:val="Choice"/>
-      </w:pPr>
-      <w:r>
-        <w:t>d)</w:t>
-        <w:tab/>
-        <w:t>Cable</w:t>
       </w:r>
     </w:p>
     <w:p>
@@ -738,17 +738,17 @@
       <w:r>
         <w:t>c)</w:t>
         <w:tab/>
+        <w:t>Toma de terra</w:t>
+      </w:r>
+    </w:p>
+    <w:p>
+      <w:pPr>
+        <w:pStyle w:val="Choice"/>
+      </w:pPr>
+      <w:r>
+        <w:t>d)</w:t>
+        <w:tab/>
         <w:t>Xerador de corrente alterna</w:t>
-      </w:r>
-    </w:p>
-    <w:p>
-      <w:pPr>
-        <w:pStyle w:val="Choice"/>
-      </w:pPr>
-      <w:r>
-        <w:t>d)</w:t>
-        <w:tab/>
-        <w:t>Toma de terra</w:t>
       </w:r>
     </w:p>
     <w:p>
@@ -805,6 +805,16 @@
       <w:r>
         <w:t>a)</w:t>
         <w:tab/>
+        <w:t>Batería ou pila</w:t>
+      </w:r>
+    </w:p>
+    <w:p>
+      <w:pPr>
+        <w:pStyle w:val="Choice"/>
+      </w:pPr>
+      <w:r>
+        <w:t>b)</w:t>
+        <w:tab/>
         <w:t>Lámpada</w:t>
       </w:r>
     </w:p>
@@ -813,29 +823,19 @@
         <w:pStyle w:val="Choice"/>
       </w:pPr>
       <w:r>
-        <w:t>b)</w:t>
+        <w:t>c)</w:t>
+        <w:tab/>
+        <w:t>Motor eléctrico</w:t>
+      </w:r>
+    </w:p>
+    <w:p>
+      <w:pPr>
+        <w:pStyle w:val="Choice"/>
+      </w:pPr>
+      <w:r>
+        <w:t>d)</w:t>
         <w:tab/>
         <w:t>Xerador de corrente alterna</w:t>
-      </w:r>
-    </w:p>
-    <w:p>
-      <w:pPr>
-        <w:pStyle w:val="Choice"/>
-      </w:pPr>
-      <w:r>
-        <w:t>c)</w:t>
-        <w:tab/>
-        <w:t>Batería ou pila</w:t>
-      </w:r>
-    </w:p>
-    <w:p>
-      <w:pPr>
-        <w:pStyle w:val="Choice"/>
-      </w:pPr>
-      <w:r>
-        <w:t>d)</w:t>
-        <w:tab/>
-        <w:t>Motor eléctrico</w:t>
       </w:r>
     </w:p>
     <w:p>
@@ -892,6 +892,16 @@
       <w:r>
         <w:t>a)</w:t>
         <w:tab/>
+        <w:t>pila</w:t>
+      </w:r>
+    </w:p>
+    <w:p>
+      <w:pPr>
+        <w:pStyle w:val="Choice"/>
+      </w:pPr>
+      <w:r>
+        <w:t>b)</w:t>
+        <w:tab/>
         <w:t>interruptor</w:t>
       </w:r>
     </w:p>
@@ -900,7 +910,7 @@
         <w:pStyle w:val="Choice"/>
       </w:pPr>
       <w:r>
-        <w:t>b)</w:t>
+        <w:t>c)</w:t>
         <w:tab/>
         <w:t>conmutador</w:t>
       </w:r>
@@ -910,19 +920,9 @@
         <w:pStyle w:val="Choice"/>
       </w:pPr>
       <w:r>
-        <w:t>c)</w:t>
+        <w:t>d)</w:t>
         <w:tab/>
         <w:t>pulsador</w:t>
-      </w:r>
-    </w:p>
-    <w:p>
-      <w:pPr>
-        <w:pStyle w:val="Choice"/>
-      </w:pPr>
-      <w:r>
-        <w:t>d)</w:t>
-        <w:tab/>
-        <w:t>pila</w:t>
       </w:r>
     </w:p>
     <w:p>
@@ -979,6 +979,26 @@
       <w:r>
         <w:t>a)</w:t>
         <w:tab/>
+        <w:t>conmutador</w:t>
+      </w:r>
+    </w:p>
+    <w:p>
+      <w:pPr>
+        <w:pStyle w:val="Choice"/>
+      </w:pPr>
+      <w:r>
+        <w:t>b)</w:t>
+        <w:tab/>
+        <w:t>pulsador</w:t>
+      </w:r>
+    </w:p>
+    <w:p>
+      <w:pPr>
+        <w:pStyle w:val="Choice"/>
+      </w:pPr>
+      <w:r>
+        <w:t>c)</w:t>
+        <w:tab/>
         <w:t>interruptor</w:t>
       </w:r>
     </w:p>
@@ -987,29 +1007,9 @@
         <w:pStyle w:val="Choice"/>
       </w:pPr>
       <w:r>
-        <w:t>b)</w:t>
-        <w:tab/>
-        <w:t>pulsador</w:t>
-      </w:r>
-    </w:p>
-    <w:p>
-      <w:pPr>
-        <w:pStyle w:val="Choice"/>
-      </w:pPr>
-      <w:r>
-        <w:t>c)</w:t>
+        <w:t>d)</w:t>
         <w:tab/>
         <w:t>botón</w:t>
-      </w:r>
-    </w:p>
-    <w:p>
-      <w:pPr>
-        <w:pStyle w:val="Choice"/>
-      </w:pPr>
-      <w:r>
-        <w:t>d)</w:t>
-        <w:tab/>
-        <w:t>conmutador</w:t>
       </w:r>
     </w:p>
     <w:p>
@@ -1076,17 +1076,17 @@
       <w:r>
         <w:t>b)</w:t>
         <w:tab/>
+        <w:t>conmutador</w:t>
+      </w:r>
+    </w:p>
+    <w:p>
+      <w:pPr>
+        <w:pStyle w:val="Choice"/>
+      </w:pPr>
+      <w:r>
+        <w:t>c)</w:t>
+        <w:tab/>
         <w:t>interruptor</w:t>
-      </w:r>
-    </w:p>
-    <w:p>
-      <w:pPr>
-        <w:pStyle w:val="Choice"/>
-      </w:pPr>
-      <w:r>
-        <w:t>c)</w:t>
-        <w:tab/>
-        <w:t>conmutador</w:t>
       </w:r>
     </w:p>
     <w:p>
@@ -1153,6 +1153,16 @@
       <w:r>
         <w:t>a)</w:t>
         <w:tab/>
+        <w:t>lámpada</w:t>
+      </w:r>
+    </w:p>
+    <w:p>
+      <w:pPr>
+        <w:pStyle w:val="Choice"/>
+      </w:pPr>
+      <w:r>
+        <w:t>b)</w:t>
+        <w:tab/>
         <w:t>resistencia</w:t>
       </w:r>
     </w:p>
@@ -1161,19 +1171,9 @@
         <w:pStyle w:val="Choice"/>
       </w:pPr>
       <w:r>
-        <w:t>b)</w:t>
+        <w:t>c)</w:t>
         <w:tab/>
         <w:t>interruptor</w:t>
-      </w:r>
-    </w:p>
-    <w:p>
-      <w:pPr>
-        <w:pStyle w:val="Choice"/>
-      </w:pPr>
-      <w:r>
-        <w:t>c)</w:t>
-        <w:tab/>
-        <w:t>lámpada</w:t>
       </w:r>
     </w:p>
     <w:p>
@@ -1240,6 +1240,26 @@
       <w:r>
         <w:t>a)</w:t>
         <w:tab/>
+        <w:t>resistencia</w:t>
+      </w:r>
+    </w:p>
+    <w:p>
+      <w:pPr>
+        <w:pStyle w:val="Choice"/>
+      </w:pPr>
+      <w:r>
+        <w:t>b)</w:t>
+        <w:tab/>
+        <w:t>interruptor</w:t>
+      </w:r>
+    </w:p>
+    <w:p>
+      <w:pPr>
+        <w:pStyle w:val="Choice"/>
+      </w:pPr>
+      <w:r>
+        <w:t>c)</w:t>
+        <w:tab/>
         <w:t>lámpada</w:t>
       </w:r>
     </w:p>
@@ -1248,29 +1268,9 @@
         <w:pStyle w:val="Choice"/>
       </w:pPr>
       <w:r>
-        <w:t>b)</w:t>
-        <w:tab/>
-        <w:t>resistencia</w:t>
-      </w:r>
-    </w:p>
-    <w:p>
-      <w:pPr>
-        <w:pStyle w:val="Choice"/>
-      </w:pPr>
-      <w:r>
-        <w:t>c)</w:t>
+        <w:t>d)</w:t>
         <w:tab/>
         <w:t>pila</w:t>
-      </w:r>
-    </w:p>
-    <w:p>
-      <w:pPr>
-        <w:pStyle w:val="Choice"/>
-      </w:pPr>
-      <w:r>
-        <w:t>d)</w:t>
-        <w:tab/>
-        <w:t>interruptor</w:t>
       </w:r>
     </w:p>
     <w:p>
@@ -1327,37 +1327,37 @@
       <w:r>
         <w:t>a)</w:t>
         <w:tab/>
+        <w:t>LED</w:t>
+      </w:r>
+    </w:p>
+    <w:p>
+      <w:pPr>
+        <w:pStyle w:val="Choice"/>
+      </w:pPr>
+      <w:r>
+        <w:t>b)</w:t>
+        <w:tab/>
+        <w:t>Motor</w:t>
+      </w:r>
+    </w:p>
+    <w:p>
+      <w:pPr>
+        <w:pStyle w:val="Choice"/>
+      </w:pPr>
+      <w:r>
+        <w:t>c)</w:t>
+        <w:tab/>
+        <w:t>lámpada</w:t>
+      </w:r>
+    </w:p>
+    <w:p>
+      <w:pPr>
+        <w:pStyle w:val="Choice"/>
+      </w:pPr>
+      <w:r>
+        <w:t>d)</w:t>
+        <w:tab/>
         <w:t>Altofalante</w:t>
-      </w:r>
-    </w:p>
-    <w:p>
-      <w:pPr>
-        <w:pStyle w:val="Choice"/>
-      </w:pPr>
-      <w:r>
-        <w:t>b)</w:t>
-        <w:tab/>
-        <w:t>Motor</w:t>
-      </w:r>
-    </w:p>
-    <w:p>
-      <w:pPr>
-        <w:pStyle w:val="Choice"/>
-      </w:pPr>
-      <w:r>
-        <w:t>c)</w:t>
-        <w:tab/>
-        <w:t>LED</w:t>
-      </w:r>
-    </w:p>
-    <w:p>
-      <w:pPr>
-        <w:pStyle w:val="Choice"/>
-      </w:pPr>
-      <w:r>
-        <w:t>d)</w:t>
-        <w:tab/>
-        <w:t>lámpada</w:t>
       </w:r>
     </w:p>
     <w:p>
@@ -1414,37 +1414,37 @@
       <w:r>
         <w:t>a)</w:t>
         <w:tab/>
+        <w:t>Patrulla X</w:t>
+      </w:r>
+    </w:p>
+    <w:p>
+      <w:pPr>
+        <w:pStyle w:val="Choice"/>
+      </w:pPr>
+      <w:r>
+        <w:t>b)</w:t>
+        <w:tab/>
+        <w:t>Motor</w:t>
+      </w:r>
+    </w:p>
+    <w:p>
+      <w:pPr>
+        <w:pStyle w:val="Choice"/>
+      </w:pPr>
+      <w:r>
+        <w:t>c)</w:t>
+        <w:tab/>
+        <w:t>Lámpada</w:t>
+      </w:r>
+    </w:p>
+    <w:p>
+      <w:pPr>
+        <w:pStyle w:val="Choice"/>
+      </w:pPr>
+      <w:r>
+        <w:t>d)</w:t>
+        <w:tab/>
         <w:t>LED</w:t>
-      </w:r>
-    </w:p>
-    <w:p>
-      <w:pPr>
-        <w:pStyle w:val="Choice"/>
-      </w:pPr>
-      <w:r>
-        <w:t>b)</w:t>
-        <w:tab/>
-        <w:t>Lámpada</w:t>
-      </w:r>
-    </w:p>
-    <w:p>
-      <w:pPr>
-        <w:pStyle w:val="Choice"/>
-      </w:pPr>
-      <w:r>
-        <w:t>c)</w:t>
-        <w:tab/>
-        <w:t>Motor</w:t>
-      </w:r>
-    </w:p>
-    <w:p>
-      <w:pPr>
-        <w:pStyle w:val="Choice"/>
-      </w:pPr>
-      <w:r>
-        <w:t>d)</w:t>
-        <w:tab/>
-        <w:t>Patrulla X</w:t>
       </w:r>
     </w:p>
     <w:p>
@@ -1501,37 +1501,37 @@
       <w:r>
         <w:t>a)</w:t>
         <w:tab/>
+        <w:t>zoador</w:t>
+      </w:r>
+    </w:p>
+    <w:p>
+      <w:pPr>
+        <w:pStyle w:val="Choice"/>
+      </w:pPr>
+      <w:r>
+        <w:t>b)</w:t>
+        <w:tab/>
+        <w:t>altofalante</w:t>
+      </w:r>
+    </w:p>
+    <w:p>
+      <w:pPr>
+        <w:pStyle w:val="Choice"/>
+      </w:pPr>
+      <w:r>
+        <w:t>c)</w:t>
+        <w:tab/>
+        <w:t>Xerador Alterna</w:t>
+      </w:r>
+    </w:p>
+    <w:p>
+      <w:pPr>
+        <w:pStyle w:val="Choice"/>
+      </w:pPr>
+      <w:r>
+        <w:t>d)</w:t>
+        <w:tab/>
         <w:t>motor</w:t>
-      </w:r>
-    </w:p>
-    <w:p>
-      <w:pPr>
-        <w:pStyle w:val="Choice"/>
-      </w:pPr>
-      <w:r>
-        <w:t>b)</w:t>
-        <w:tab/>
-        <w:t>Xerador Alterna</w:t>
-      </w:r>
-    </w:p>
-    <w:p>
-      <w:pPr>
-        <w:pStyle w:val="Choice"/>
-      </w:pPr>
-      <w:r>
-        <w:t>c)</w:t>
-        <w:tab/>
-        <w:t>zoador</w:t>
-      </w:r>
-    </w:p>
-    <w:p>
-      <w:pPr>
-        <w:pStyle w:val="Choice"/>
-      </w:pPr>
-      <w:r>
-        <w:t>d)</w:t>
-        <w:tab/>
-        <w:t>altofalante</w:t>
       </w:r>
     </w:p>
     <w:p>
@@ -1608,17 +1608,17 @@
       <w:r>
         <w:t>c)</w:t>
         <w:tab/>
+        <w:t>altofalante</w:t>
+      </w:r>
+    </w:p>
+    <w:p>
+      <w:pPr>
+        <w:pStyle w:val="Choice"/>
+      </w:pPr>
+      <w:r>
+        <w:t>d)</w:t>
+        <w:tab/>
         <w:t>xerador alterna</w:t>
-      </w:r>
-    </w:p>
-    <w:p>
-      <w:pPr>
-        <w:pStyle w:val="Choice"/>
-      </w:pPr>
-      <w:r>
-        <w:t>d)</w:t>
-        <w:tab/>
-        <w:t>altofalante</w:t>
       </w:r>
     </w:p>
     <w:p>
@@ -1762,27 +1762,27 @@
       <w:r>
         <w:t>a)</w:t>
         <w:tab/>
+        <w:t>antena</w:t>
+      </w:r>
+    </w:p>
+    <w:p>
+      <w:pPr>
+        <w:pStyle w:val="Choice"/>
+      </w:pPr>
+      <w:r>
+        <w:t>b)</w:t>
+        <w:tab/>
+        <w:t>terra</w:t>
+      </w:r>
+    </w:p>
+    <w:p>
+      <w:pPr>
+        <w:pStyle w:val="Choice"/>
+      </w:pPr>
+      <w:r>
+        <w:t>c)</w:t>
+        <w:tab/>
         <w:t>receptor</w:t>
-      </w:r>
-    </w:p>
-    <w:p>
-      <w:pPr>
-        <w:pStyle w:val="Choice"/>
-      </w:pPr>
-      <w:r>
-        <w:t>b)</w:t>
-        <w:tab/>
-        <w:t>terra</w:t>
-      </w:r>
-    </w:p>
-    <w:p>
-      <w:pPr>
-        <w:pStyle w:val="Choice"/>
-      </w:pPr>
-      <w:r>
-        <w:t>c)</w:t>
-        <w:tab/>
-        <w:t>antena</w:t>
       </w:r>
     </w:p>
     <w:p>
@@ -1849,37 +1849,37 @@
       <w:r>
         <w:t>a)</w:t>
         <w:tab/>
+        <w:t>Mixto</w:t>
+      </w:r>
+    </w:p>
+    <w:p>
+      <w:pPr>
+        <w:pStyle w:val="Choice"/>
+      </w:pPr>
+      <w:r>
+        <w:t>b)</w:t>
+        <w:tab/>
+        <w:t>Serie</w:t>
+      </w:r>
+    </w:p>
+    <w:p>
+      <w:pPr>
+        <w:pStyle w:val="Choice"/>
+      </w:pPr>
+      <w:r>
+        <w:t>c)</w:t>
+        <w:tab/>
+        <w:t>Liña</w:t>
+      </w:r>
+    </w:p>
+    <w:p>
+      <w:pPr>
+        <w:pStyle w:val="Choice"/>
+      </w:pPr>
+      <w:r>
+        <w:t>d)</w:t>
+        <w:tab/>
         <w:t>Paralelo</w:t>
-      </w:r>
-    </w:p>
-    <w:p>
-      <w:pPr>
-        <w:pStyle w:val="Choice"/>
-      </w:pPr>
-      <w:r>
-        <w:t>b)</w:t>
-        <w:tab/>
-        <w:t>Mixto</w:t>
-      </w:r>
-    </w:p>
-    <w:p>
-      <w:pPr>
-        <w:pStyle w:val="Choice"/>
-      </w:pPr>
-      <w:r>
-        <w:t>c)</w:t>
-        <w:tab/>
-        <w:t>Serie</w:t>
-      </w:r>
-    </w:p>
-    <w:p>
-      <w:pPr>
-        <w:pStyle w:val="Choice"/>
-      </w:pPr>
-      <w:r>
-        <w:t>d)</w:t>
-        <w:tab/>
-        <w:t>Liña</w:t>
       </w:r>
     </w:p>
     <w:p>
@@ -1936,37 +1936,37 @@
       <w:r>
         <w:t>a)</w:t>
         <w:tab/>
+        <w:t>lateral</w:t>
+      </w:r>
+    </w:p>
+    <w:p>
+      <w:pPr>
+        <w:pStyle w:val="Choice"/>
+      </w:pPr>
+      <w:r>
+        <w:t>b)</w:t>
+        <w:tab/>
+        <w:t>Paralelo</w:t>
+      </w:r>
+    </w:p>
+    <w:p>
+      <w:pPr>
+        <w:pStyle w:val="Choice"/>
+      </w:pPr>
+      <w:r>
+        <w:t>c)</w:t>
+        <w:tab/>
+        <w:t>mixto</w:t>
+      </w:r>
+    </w:p>
+    <w:p>
+      <w:pPr>
+        <w:pStyle w:val="Choice"/>
+      </w:pPr>
+      <w:r>
+        <w:t>d)</w:t>
+        <w:tab/>
         <w:t>Serie</w:t>
-      </w:r>
-    </w:p>
-    <w:p>
-      <w:pPr>
-        <w:pStyle w:val="Choice"/>
-      </w:pPr>
-      <w:r>
-        <w:t>b)</w:t>
-        <w:tab/>
-        <w:t>Paralelo</w:t>
-      </w:r>
-    </w:p>
-    <w:p>
-      <w:pPr>
-        <w:pStyle w:val="Choice"/>
-      </w:pPr>
-      <w:r>
-        <w:t>c)</w:t>
-        <w:tab/>
-        <w:t>mixto</w:t>
-      </w:r>
-    </w:p>
-    <w:p>
-      <w:pPr>
-        <w:pStyle w:val="Choice"/>
-      </w:pPr>
-      <w:r>
-        <w:t>d)</w:t>
-        <w:tab/>
-        <w:t>lateral</w:t>
       </w:r>
     </w:p>
     <w:p>
@@ -2023,37 +2023,37 @@
       <w:r>
         <w:t>a)</w:t>
         <w:tab/>
+        <w:t>Serie</w:t>
+      </w:r>
+    </w:p>
+    <w:p>
+      <w:pPr>
+        <w:pStyle w:val="Choice"/>
+      </w:pPr>
+      <w:r>
+        <w:t>b)</w:t>
+        <w:tab/>
+        <w:t>composto</w:t>
+      </w:r>
+    </w:p>
+    <w:p>
+      <w:pPr>
+        <w:pStyle w:val="Choice"/>
+      </w:pPr>
+      <w:r>
+        <w:t>c)</w:t>
+        <w:tab/>
+        <w:t>Mixto</w:t>
+      </w:r>
+    </w:p>
+    <w:p>
+      <w:pPr>
+        <w:pStyle w:val="Choice"/>
+      </w:pPr>
+      <w:r>
+        <w:t>d)</w:t>
+        <w:tab/>
         <w:t>Paralelo</w:t>
-      </w:r>
-    </w:p>
-    <w:p>
-      <w:pPr>
-        <w:pStyle w:val="Choice"/>
-      </w:pPr>
-      <w:r>
-        <w:t>b)</w:t>
-        <w:tab/>
-        <w:t>composto</w:t>
-      </w:r>
-    </w:p>
-    <w:p>
-      <w:pPr>
-        <w:pStyle w:val="Choice"/>
-      </w:pPr>
-      <w:r>
-        <w:t>c)</w:t>
-        <w:tab/>
-        <w:t>Mixto</w:t>
-      </w:r>
-    </w:p>
-    <w:p>
-      <w:pPr>
-        <w:pStyle w:val="Choice"/>
-      </w:pPr>
-      <w:r>
-        <w:t>d)</w:t>
-        <w:tab/>
-        <w:t>Serie</w:t>
       </w:r>
     </w:p>
     <w:p>
@@ -2110,37 +2110,37 @@
       <w:r>
         <w:t>a)</w:t>
         <w:tab/>
+        <w:t>2V</w:t>
+      </w:r>
+    </w:p>
+    <w:p>
+      <w:pPr>
+        <w:pStyle w:val="Choice"/>
+      </w:pPr>
+      <w:r>
+        <w:t>b)</w:t>
+        <w:tab/>
+        <w:t>6V</w:t>
+      </w:r>
+    </w:p>
+    <w:p>
+      <w:pPr>
+        <w:pStyle w:val="Choice"/>
+      </w:pPr>
+      <w:r>
+        <w:t>c)</w:t>
+        <w:tab/>
+        <w:t>2/3V</w:t>
+      </w:r>
+    </w:p>
+    <w:p>
+      <w:pPr>
+        <w:pStyle w:val="Choice"/>
+      </w:pPr>
+      <w:r>
+        <w:t>d)</w:t>
+        <w:tab/>
         <w:t>8V</w:t>
-      </w:r>
-    </w:p>
-    <w:p>
-      <w:pPr>
-        <w:pStyle w:val="Choice"/>
-      </w:pPr>
-      <w:r>
-        <w:t>b)</w:t>
-        <w:tab/>
-        <w:t>6V</w:t>
-      </w:r>
-    </w:p>
-    <w:p>
-      <w:pPr>
-        <w:pStyle w:val="Choice"/>
-      </w:pPr>
-      <w:r>
-        <w:t>c)</w:t>
-        <w:tab/>
-        <w:t>2/3V</w:t>
-      </w:r>
-    </w:p>
-    <w:p>
-      <w:pPr>
-        <w:pStyle w:val="Choice"/>
-      </w:pPr>
-      <w:r>
-        <w:t>d)</w:t>
-        <w:tab/>
-        <w:t>2V</w:t>
       </w:r>
     </w:p>
     <w:p>
@@ -2207,17 +2207,17 @@
       <w:r>
         <w:t>b)</w:t>
         <w:tab/>
+        <w:t>8V</w:t>
+      </w:r>
+    </w:p>
+    <w:p>
+      <w:pPr>
+        <w:pStyle w:val="Choice"/>
+      </w:pPr>
+      <w:r>
+        <w:t>c)</w:t>
+        <w:tab/>
         <w:t>2V</w:t>
-      </w:r>
-    </w:p>
-    <w:p>
-      <w:pPr>
-        <w:pStyle w:val="Choice"/>
-      </w:pPr>
-      <w:r>
-        <w:t>c)</w:t>
-        <w:tab/>
-        <w:t>8V</w:t>
       </w:r>
     </w:p>
     <w:p>
@@ -2284,6 +2284,16 @@
       <w:r>
         <w:t>a)</w:t>
         <w:tab/>
+        <w:t>6/8Ω</w:t>
+      </w:r>
+    </w:p>
+    <w:p>
+      <w:pPr>
+        <w:pStyle w:val="Choice"/>
+      </w:pPr>
+      <w:r>
+        <w:t>b)</w:t>
+        <w:tab/>
         <w:t>12Ω</w:t>
       </w:r>
     </w:p>
@@ -2292,19 +2302,9 @@
         <w:pStyle w:val="Choice"/>
       </w:pPr>
       <w:r>
-        <w:t>b)</w:t>
+        <w:t>c)</w:t>
         <w:tab/>
         <w:t>7Ω</w:t>
-      </w:r>
-    </w:p>
-    <w:p>
-      <w:pPr>
-        <w:pStyle w:val="Choice"/>
-      </w:pPr>
-      <w:r>
-        <w:t>c)</w:t>
-        <w:tab/>
-        <w:t>6/8Ω</w:t>
       </w:r>
     </w:p>
     <w:p>
@@ -2371,6 +2371,26 @@
       <w:r>
         <w:t>a)</w:t>
         <w:tab/>
+        <w:t>0,5Ω</w:t>
+      </w:r>
+    </w:p>
+    <w:p>
+      <w:pPr>
+        <w:pStyle w:val="Choice"/>
+      </w:pPr>
+      <w:r>
+        <w:t>b)</w:t>
+        <w:tab/>
+        <w:t>18Ω</w:t>
+      </w:r>
+    </w:p>
+    <w:p>
+      <w:pPr>
+        <w:pStyle w:val="Choice"/>
+      </w:pPr>
+      <w:r>
+        <w:t>c)</w:t>
+        <w:tab/>
         <w:t>3/6Ω</w:t>
       </w:r>
     </w:p>
@@ -2379,29 +2399,9 @@
         <w:pStyle w:val="Choice"/>
       </w:pPr>
       <w:r>
-        <w:t>b)</w:t>
-        <w:tab/>
-        <w:t>18Ω</w:t>
-      </w:r>
-    </w:p>
-    <w:p>
-      <w:pPr>
-        <w:pStyle w:val="Choice"/>
-      </w:pPr>
-      <w:r>
-        <w:t>c)</w:t>
+        <w:t>d)</w:t>
         <w:tab/>
         <w:t>2Ω</w:t>
-      </w:r>
-    </w:p>
-    <w:p>
-      <w:pPr>
-        <w:pStyle w:val="Choice"/>
-      </w:pPr>
-      <w:r>
-        <w:t>d)</w:t>
-        <w:tab/>
-        <w:t>0,5Ω</w:t>
       </w:r>
     </w:p>
     <w:p>
@@ -2458,6 +2458,16 @@
       <w:r>
         <w:t>a)</w:t>
         <w:tab/>
+        <w:t>4/5Ω</w:t>
+      </w:r>
+    </w:p>
+    <w:p>
+      <w:pPr>
+        <w:pStyle w:val="Choice"/>
+      </w:pPr>
+      <w:r>
+        <w:t>b)</w:t>
+        <w:tab/>
         <w:t>3/8Ω</w:t>
       </w:r>
     </w:p>
@@ -2466,29 +2476,19 @@
         <w:pStyle w:val="Choice"/>
       </w:pPr>
       <w:r>
-        <w:t>b)</w:t>
+        <w:t>c)</w:t>
+        <w:tab/>
+        <w:t>8/3Ω</w:t>
+      </w:r>
+    </w:p>
+    <w:p>
+      <w:pPr>
+        <w:pStyle w:val="Choice"/>
+      </w:pPr>
+      <w:r>
+        <w:t>d)</w:t>
         <w:tab/>
         <w:t>5/4Ω</w:t>
-      </w:r>
-    </w:p>
-    <w:p>
-      <w:pPr>
-        <w:pStyle w:val="Choice"/>
-      </w:pPr>
-      <w:r>
-        <w:t>c)</w:t>
-        <w:tab/>
-        <w:t>4/5Ω</w:t>
-      </w:r>
-    </w:p>
-    <w:p>
-      <w:pPr>
-        <w:pStyle w:val="Choice"/>
-      </w:pPr>
-      <w:r>
-        <w:t>d)</w:t>
-        <w:tab/>
-        <w:t>8/3Ω</w:t>
       </w:r>
     </w:p>
     <w:p>
@@ -2545,27 +2545,27 @@
       <w:r>
         <w:t>a)</w:t>
         <w:tab/>
+        <w:t>2Ω</w:t>
+      </w:r>
+    </w:p>
+    <w:p>
+      <w:pPr>
+        <w:pStyle w:val="Choice"/>
+      </w:pPr>
+      <w:r>
+        <w:t>b)</w:t>
+        <w:tab/>
+        <w:t>0,5Ω</w:t>
+      </w:r>
+    </w:p>
+    <w:p>
+      <w:pPr>
+        <w:pStyle w:val="Choice"/>
+      </w:pPr>
+      <w:r>
+        <w:t>c)</w:t>
+        <w:tab/>
         <w:t>9Ω</w:t>
-      </w:r>
-    </w:p>
-    <w:p>
-      <w:pPr>
-        <w:pStyle w:val="Choice"/>
-      </w:pPr>
-      <w:r>
-        <w:t>b)</w:t>
-        <w:tab/>
-        <w:t>0,5Ω</w:t>
-      </w:r>
-    </w:p>
-    <w:p>
-      <w:pPr>
-        <w:pStyle w:val="Choice"/>
-      </w:pPr>
-      <w:r>
-        <w:t>c)</w:t>
-        <w:tab/>
-        <w:t>2Ω</w:t>
       </w:r>
     </w:p>
     <w:p>
@@ -2632,6 +2632,26 @@
       <w:r>
         <w:t>a)</w:t>
         <w:tab/>
+        <w:t>8Ω</w:t>
+      </w:r>
+    </w:p>
+    <w:p>
+      <w:pPr>
+        <w:pStyle w:val="Choice"/>
+      </w:pPr>
+      <w:r>
+        <w:t>b)</w:t>
+        <w:tab/>
+        <w:t>5Ω</w:t>
+      </w:r>
+    </w:p>
+    <w:p>
+      <w:pPr>
+        <w:pStyle w:val="Choice"/>
+      </w:pPr>
+      <w:r>
+        <w:t>c)</w:t>
+        <w:tab/>
         <w:t>4Ω</w:t>
       </w:r>
     </w:p>
@@ -2640,29 +2660,9 @@
         <w:pStyle w:val="Choice"/>
       </w:pPr>
       <w:r>
-        <w:t>b)</w:t>
+        <w:t>d)</w:t>
         <w:tab/>
         <w:t>6Ω</w:t>
-      </w:r>
-    </w:p>
-    <w:p>
-      <w:pPr>
-        <w:pStyle w:val="Choice"/>
-      </w:pPr>
-      <w:r>
-        <w:t>c)</w:t>
-        <w:tab/>
-        <w:t>8Ω</w:t>
-      </w:r>
-    </w:p>
-    <w:p>
-      <w:pPr>
-        <w:pStyle w:val="Choice"/>
-      </w:pPr>
-      <w:r>
-        <w:t>d)</w:t>
-        <w:tab/>
-        <w:t>5Ω</w:t>
       </w:r>
     </w:p>
     <w:p>
@@ -2719,6 +2719,16 @@
       <w:r>
         <w:t>a)</w:t>
         <w:tab/>
+        <w:t>6Ω</w:t>
+      </w:r>
+    </w:p>
+    <w:p>
+      <w:pPr>
+        <w:pStyle w:val="Choice"/>
+      </w:pPr>
+      <w:r>
+        <w:t>b)</w:t>
+        <w:tab/>
         <w:t>4,5Ω</w:t>
       </w:r>
     </w:p>
@@ -2727,19 +2737,9 @@
         <w:pStyle w:val="Choice"/>
       </w:pPr>
       <w:r>
-        <w:t>b)</w:t>
+        <w:t>c)</w:t>
         <w:tab/>
         <w:t>13Ω</w:t>
-      </w:r>
-    </w:p>
-    <w:p>
-      <w:pPr>
-        <w:pStyle w:val="Choice"/>
-      </w:pPr>
-      <w:r>
-        <w:t>c)</w:t>
-        <w:tab/>
-        <w:t>6Ω</w:t>
       </w:r>
     </w:p>
     <w:p>
@@ -2806,37 +2806,37 @@
       <w:r>
         <w:t>a)</w:t>
         <w:tab/>
+        <w:t>20Ω</w:t>
+      </w:r>
+    </w:p>
+    <w:p>
+      <w:pPr>
+        <w:pStyle w:val="Choice"/>
+      </w:pPr>
+      <w:r>
+        <w:t>b)</w:t>
+        <w:tab/>
+        <w:t>10Ω</w:t>
+      </w:r>
+    </w:p>
+    <w:p>
+      <w:pPr>
+        <w:pStyle w:val="Choice"/>
+      </w:pPr>
+      <w:r>
+        <w:t>c)</w:t>
+        <w:tab/>
+        <w:t>5Ω</w:t>
+      </w:r>
+    </w:p>
+    <w:p>
+      <w:pPr>
+        <w:pStyle w:val="Choice"/>
+      </w:pPr>
+      <w:r>
+        <w:t>d)</w:t>
+        <w:tab/>
         <w:t>1,2Ω</w:t>
-      </w:r>
-    </w:p>
-    <w:p>
-      <w:pPr>
-        <w:pStyle w:val="Choice"/>
-      </w:pPr>
-      <w:r>
-        <w:t>b)</w:t>
-        <w:tab/>
-        <w:t>5Ω</w:t>
-      </w:r>
-    </w:p>
-    <w:p>
-      <w:pPr>
-        <w:pStyle w:val="Choice"/>
-      </w:pPr>
-      <w:r>
-        <w:t>c)</w:t>
-        <w:tab/>
-        <w:t>10Ω</w:t>
-      </w:r>
-    </w:p>
-    <w:p>
-      <w:pPr>
-        <w:pStyle w:val="Choice"/>
-      </w:pPr>
-      <w:r>
-        <w:t>d)</w:t>
-        <w:tab/>
-        <w:t>20Ω</w:t>
       </w:r>
     </w:p>
     <w:p>
@@ -2893,6 +2893,26 @@
       <w:r>
         <w:t>a)</w:t>
         <w:tab/>
+        <w:t>No circuíto 2, o led acende aínda que non cerremos o interruptor</w:t>
+      </w:r>
+    </w:p>
+    <w:p>
+      <w:pPr>
+        <w:pStyle w:val="Choice"/>
+      </w:pPr>
+      <w:r>
+        <w:t>b)</w:t>
+        <w:tab/>
+        <w:t>Os dous leds acenden ao premer o interruptor, pero o 1 un chisco antes</w:t>
+      </w:r>
+    </w:p>
+    <w:p>
+      <w:pPr>
+        <w:pStyle w:val="Choice"/>
+      </w:pPr>
+      <w:r>
+        <w:t>c)</w:t>
+        <w:tab/>
         <w:t>Os dous leds acenden ao premer o interruptor, pero o 2 un chisco antes</w:t>
       </w:r>
     </w:p>
@@ -2901,29 +2921,9 @@
         <w:pStyle w:val="Choice"/>
       </w:pPr>
       <w:r>
-        <w:t>b)</w:t>
-        <w:tab/>
-        <w:t>No circuíto 2, o led acende aínda que non cerremos o interruptor</w:t>
-      </w:r>
-    </w:p>
-    <w:p>
-      <w:pPr>
-        <w:pStyle w:val="Choice"/>
-      </w:pPr>
-      <w:r>
-        <w:t>c)</w:t>
+        <w:t>d)</w:t>
         <w:tab/>
         <w:t>Ningunha</w:t>
-      </w:r>
-    </w:p>
-    <w:p>
-      <w:pPr>
-        <w:pStyle w:val="Choice"/>
-      </w:pPr>
-      <w:r>
-        <w:t>d)</w:t>
-        <w:tab/>
-        <w:t>Os dous leds acenden ao premer o interruptor, pero o 1 un chisco antes</w:t>
       </w:r>
     </w:p>
     <w:p>
@@ -2980,6 +2980,26 @@
       <w:r>
         <w:t>a)</w:t>
         <w:tab/>
+        <w:t>Os dous leds acenderán ao premer o interruptor</w:t>
+      </w:r>
+    </w:p>
+    <w:p>
+      <w:pPr>
+        <w:pStyle w:val="Choice"/>
+      </w:pPr>
+      <w:r>
+        <w:t>b)</w:t>
+        <w:tab/>
+        <w:t>Se o led -b- se queima, o -a- deixará de funcionar</w:t>
+      </w:r>
+    </w:p>
+    <w:p>
+      <w:pPr>
+        <w:pStyle w:val="Choice"/>
+      </w:pPr>
+      <w:r>
+        <w:t>c)</w:t>
+        <w:tab/>
         <w:t>A intensidade que circula polos dous leds é a mesma</w:t>
       </w:r>
     </w:p>
@@ -2988,29 +3008,9 @@
         <w:pStyle w:val="Choice"/>
       </w:pPr>
       <w:r>
-        <w:t>b)</w:t>
-        <w:tab/>
-        <w:t>Se o led -b- se queima, o -a- deixará de funcionar</w:t>
-      </w:r>
-    </w:p>
-    <w:p>
-      <w:pPr>
-        <w:pStyle w:val="Choice"/>
-      </w:pPr>
-      <w:r>
-        <w:t>c)</w:t>
+        <w:t>d)</w:t>
         <w:tab/>
         <w:t>O led -a- acenderá un chisco antes que o -b-</w:t>
-      </w:r>
-    </w:p>
-    <w:p>
-      <w:pPr>
-        <w:pStyle w:val="Choice"/>
-      </w:pPr>
-      <w:r>
-        <w:t>d)</w:t>
-        <w:tab/>
-        <w:t>Os dous leds acenderán ao premer o interruptor</w:t>
       </w:r>
     </w:p>
     <w:p>
@@ -3067,37 +3067,37 @@
       <w:r>
         <w:t>a)</w:t>
         <w:tab/>
+        <w:t>Se o interruptor pecha, pasará intensidade polas dúas resistencias</w:t>
+      </w:r>
+    </w:p>
+    <w:p>
+      <w:pPr>
+        <w:pStyle w:val="Choice"/>
+      </w:pPr>
+      <w:r>
+        <w:t>b)</w:t>
+        <w:tab/>
+        <w:t>Polas dúas resistencias pasará sempre a mesma intensidade</w:t>
+      </w:r>
+    </w:p>
+    <w:p>
+      <w:pPr>
+        <w:pStyle w:val="Choice"/>
+      </w:pPr>
+      <w:r>
+        <w:t>c)</w:t>
+        <w:tab/>
+        <w:t>Se desconecto a resistencia -b- non pasará corrente polo circuíto</w:t>
+      </w:r>
+    </w:p>
+    <w:p>
+      <w:pPr>
+        <w:pStyle w:val="Choice"/>
+      </w:pPr>
+      <w:r>
+        <w:t>d)</w:t>
+        <w:tab/>
         <w:t>As dúas resistencias están sometidas á mesma voltaxe</w:t>
-      </w:r>
-    </w:p>
-    <w:p>
-      <w:pPr>
-        <w:pStyle w:val="Choice"/>
-      </w:pPr>
-      <w:r>
-        <w:t>b)</w:t>
-        <w:tab/>
-        <w:t>Polas dúas resistencias pasará sempre a mesma intensidade</w:t>
-      </w:r>
-    </w:p>
-    <w:p>
-      <w:pPr>
-        <w:pStyle w:val="Choice"/>
-      </w:pPr>
-      <w:r>
-        <w:t>c)</w:t>
-        <w:tab/>
-        <w:t>Se desconecto a resistencia -b- non pasará corrente polo circuíto</w:t>
-      </w:r>
-    </w:p>
-    <w:p>
-      <w:pPr>
-        <w:pStyle w:val="Choice"/>
-      </w:pPr>
-      <w:r>
-        <w:t>d)</w:t>
-        <w:tab/>
-        <w:t>Se o interruptor pecha, pasará intensidade polas dúas resistencias</w:t>
       </w:r>
     </w:p>
     <w:p>
@@ -3154,6 +3154,16 @@
       <w:r>
         <w:t>a)</w:t>
         <w:tab/>
+        <w:t>As dúas resistencias están sometidas á mesma voltaxe</w:t>
+      </w:r>
+    </w:p>
+    <w:p>
+      <w:pPr>
+        <w:pStyle w:val="Choice"/>
+      </w:pPr>
+      <w:r>
+        <w:t>b)</w:t>
+        <w:tab/>
         <w:t>A intensidade que pasa polas dúas resistencias é a mesma</w:t>
       </w:r>
     </w:p>
@@ -3162,29 +3172,19 @@
         <w:pStyle w:val="Choice"/>
       </w:pPr>
       <w:r>
-        <w:t>b)</w:t>
-        <w:tab/>
-        <w:t>As dúas resistencias están sometidas á mesma voltaxe</w:t>
-      </w:r>
-    </w:p>
-    <w:p>
-      <w:pPr>
-        <w:pStyle w:val="Choice"/>
-      </w:pPr>
-      <w:r>
         <w:t>c)</w:t>
         <w:tab/>
+        <w:t>Se desconecto a resistencia -a-, seguirá a pasar corrente pola -b-</w:t>
+      </w:r>
+    </w:p>
+    <w:p>
+      <w:pPr>
+        <w:pStyle w:val="Choice"/>
+      </w:pPr>
+      <w:r>
+        <w:t>d)</w:t>
+        <w:tab/>
         <w:t>A intensidade total do circuíto será a suma da intensidade por -a- e a intensidade por -b-</w:t>
-      </w:r>
-    </w:p>
-    <w:p>
-      <w:pPr>
-        <w:pStyle w:val="Choice"/>
-      </w:pPr>
-      <w:r>
-        <w:t>d)</w:t>
-        <w:tab/>
-        <w:t>Se desconecto a resistencia -a-, seguirá a pasar corrente pola -b-</w:t>
       </w:r>
     </w:p>
     <w:p>
@@ -3241,37 +3241,37 @@
       <w:r>
         <w:t>a)</w:t>
         <w:tab/>
+        <w:t>Pasará o doble de intensidade que pola resistencia -b-</w:t>
+      </w:r>
+    </w:p>
+    <w:p>
+      <w:pPr>
+        <w:pStyle w:val="Choice"/>
+      </w:pPr>
+      <w:r>
+        <w:t>b)</w:t>
+        <w:tab/>
+        <w:t>Pasará a metade de intensidade que pola resistencia -b-</w:t>
+      </w:r>
+    </w:p>
+    <w:p>
+      <w:pPr>
+        <w:pStyle w:val="Choice"/>
+      </w:pPr>
+      <w:r>
+        <w:t>c)</w:t>
+        <w:tab/>
+        <w:t>Pasará a mesma intensidade que pola resitencia -b-</w:t>
+      </w:r>
+    </w:p>
+    <w:p>
+      <w:pPr>
+        <w:pStyle w:val="Choice"/>
+      </w:pPr>
+      <w:r>
+        <w:t>d)</w:t>
+        <w:tab/>
         <w:t>Por ela pasará a metade da intensidade total do circuíto</w:t>
-      </w:r>
-    </w:p>
-    <w:p>
-      <w:pPr>
-        <w:pStyle w:val="Choice"/>
-      </w:pPr>
-      <w:r>
-        <w:t>b)</w:t>
-        <w:tab/>
-        <w:t>Pasará a metade de intensidade que pola resistencia -b-</w:t>
-      </w:r>
-    </w:p>
-    <w:p>
-      <w:pPr>
-        <w:pStyle w:val="Choice"/>
-      </w:pPr>
-      <w:r>
-        <w:t>c)</w:t>
-        <w:tab/>
-        <w:t>Pasará o doble de intensidade que pola resistencia -b-</w:t>
-      </w:r>
-    </w:p>
-    <w:p>
-      <w:pPr>
-        <w:pStyle w:val="Choice"/>
-      </w:pPr>
-      <w:r>
-        <w:t>d)</w:t>
-        <w:tab/>
-        <w:t>Pasará a mesma intensidade que pola resitencia -b-</w:t>
       </w:r>
     </w:p>
     <w:p>
@@ -3328,6 +3328,16 @@
       <w:r>
         <w:t>a)</w:t>
         <w:tab/>
+        <w:t>Pola -c-</w:t>
+      </w:r>
+    </w:p>
+    <w:p>
+      <w:pPr>
+        <w:pStyle w:val="Choice"/>
+      </w:pPr>
+      <w:r>
+        <w:t>b)</w:t>
+        <w:tab/>
         <w:t>Por todas pasará a mesma</w:t>
       </w:r>
     </w:p>
@@ -3336,29 +3346,19 @@
         <w:pStyle w:val="Choice"/>
       </w:pPr>
       <w:r>
-        <w:t>b)</w:t>
+        <w:t>c)</w:t>
+        <w:tab/>
+        <w:t>Pola -a-</w:t>
+      </w:r>
+    </w:p>
+    <w:p>
+      <w:pPr>
+        <w:pStyle w:val="Choice"/>
+      </w:pPr>
+      <w:r>
+        <w:t>d)</w:t>
         <w:tab/>
         <w:t>Pola -b-</w:t>
-      </w:r>
-    </w:p>
-    <w:p>
-      <w:pPr>
-        <w:pStyle w:val="Choice"/>
-      </w:pPr>
-      <w:r>
-        <w:t>c)</w:t>
-        <w:tab/>
-        <w:t>Pola -a-</w:t>
-      </w:r>
-    </w:p>
-    <w:p>
-      <w:pPr>
-        <w:pStyle w:val="Choice"/>
-      </w:pPr>
-      <w:r>
-        <w:t>d)</w:t>
-        <w:tab/>
-        <w:t>Pola -c-</w:t>
       </w:r>
     </w:p>
     <w:p>
@@ -3415,6 +3415,16 @@
       <w:r>
         <w:t>a)</w:t>
         <w:tab/>
+        <w:t>A intensidade total aumentará respecto a cando había dúas</w:t>
+      </w:r>
+    </w:p>
+    <w:p>
+      <w:pPr>
+        <w:pStyle w:val="Choice"/>
+      </w:pPr>
+      <w:r>
+        <w:t>b)</w:t>
+        <w:tab/>
         <w:t>A voltaxe á que están sometidas ás resistencias disminuirá respecto a cando había dúas</w:t>
       </w:r>
     </w:p>
@@ -3423,29 +3433,19 @@
         <w:pStyle w:val="Choice"/>
       </w:pPr>
       <w:r>
-        <w:t>b)</w:t>
+        <w:t>c)</w:t>
+        <w:tab/>
+        <w:t>A voltaxe á que están sometidas ás resistencias aumentará respecto a cando había dúas</w:t>
+      </w:r>
+    </w:p>
+    <w:p>
+      <w:pPr>
+        <w:pStyle w:val="Choice"/>
+      </w:pPr>
+      <w:r>
+        <w:t>d)</w:t>
         <w:tab/>
         <w:t>A intensidade total disminuirá respecto a cando había dúas</w:t>
-      </w:r>
-    </w:p>
-    <w:p>
-      <w:pPr>
-        <w:pStyle w:val="Choice"/>
-      </w:pPr>
-      <w:r>
-        <w:t>c)</w:t>
-        <w:tab/>
-        <w:t>A voltaxe á que están sometidas ás resistencias aumentará respecto a cando había dúas</w:t>
-      </w:r>
-    </w:p>
-    <w:p>
-      <w:pPr>
-        <w:pStyle w:val="Choice"/>
-      </w:pPr>
-      <w:r>
-        <w:t>d)</w:t>
-        <w:tab/>
-        <w:t>A intensidade total aumentará respecto a cando había dúas</w:t>
       </w:r>
     </w:p>
     <w:p>
@@ -3522,17 +3522,17 @@
       <w:r>
         <w:t>c)</w:t>
         <w:tab/>
+        <w:t>Se cerramos un ou outro interruptor, pasará corrente pola resistencia</w:t>
+      </w:r>
+    </w:p>
+    <w:p>
+      <w:pPr>
+        <w:pStyle w:val="Choice"/>
+      </w:pPr>
+      <w:r>
+        <w:t>d)</w:t>
+        <w:tab/>
         <w:t>Se cerramos un e outro interruptor, pasará corrente pola resistencia</w:t>
-      </w:r>
-    </w:p>
-    <w:p>
-      <w:pPr>
-        <w:pStyle w:val="Choice"/>
-      </w:pPr>
-      <w:r>
-        <w:t>d)</w:t>
-        <w:tab/>
-        <w:t>Se cerramos un ou outro interruptor, pasará corrente pola resistencia</w:t>
       </w:r>
     </w:p>
     <w:p>
@@ -3676,6 +3676,26 @@
       <w:r>
         <w:t>a)</w:t>
         <w:tab/>
+        <w:t>Para que pase a corrente, podemos cerrar calquera dos dous interruptores</w:t>
+      </w:r>
+    </w:p>
+    <w:p>
+      <w:pPr>
+        <w:pStyle w:val="Choice"/>
+      </w:pPr>
+      <w:r>
+        <w:t>b)</w:t>
+        <w:tab/>
+        <w:t>A corrente pasará cando cerremos os dous interruptores</w:t>
+      </w:r>
+    </w:p>
+    <w:p>
+      <w:pPr>
+        <w:pStyle w:val="Choice"/>
+      </w:pPr>
+      <w:r>
+        <w:t>c)</w:t>
+        <w:tab/>
         <w:t>Se cerramos un ou outro interruptor, pasará corrente pola resistencia</w:t>
       </w:r>
     </w:p>
@@ -3684,29 +3704,9 @@
         <w:pStyle w:val="Choice"/>
       </w:pPr>
       <w:r>
-        <w:t>b)</w:t>
+        <w:t>d)</w:t>
         <w:tab/>
         <w:t>A corrente pasa sempre que haxa polo menos un interruptor cerrado</w:t>
-      </w:r>
-    </w:p>
-    <w:p>
-      <w:pPr>
-        <w:pStyle w:val="Choice"/>
-      </w:pPr>
-      <w:r>
-        <w:t>c)</w:t>
-        <w:tab/>
-        <w:t>Para que pase a corrente, podemos cerrar calquera dos dous interruptores</w:t>
-      </w:r>
-    </w:p>
-    <w:p>
-      <w:pPr>
-        <w:pStyle w:val="Choice"/>
-      </w:pPr>
-      <w:r>
-        <w:t>d)</w:t>
-        <w:tab/>
-        <w:t>A corrente pasará cando cerremos os dous interruptores</w:t>
       </w:r>
     </w:p>
     <w:p>
@@ -3763,6 +3763,26 @@
       <w:r>
         <w:t>a)</w:t>
         <w:tab/>
+        <w:t>O led -a- acenderá</w:t>
+      </w:r>
+    </w:p>
+    <w:p>
+      <w:pPr>
+        <w:pStyle w:val="Choice"/>
+      </w:pPr>
+      <w:r>
+        <w:t>b)</w:t>
+        <w:tab/>
+        <w:t>O led -a- está curtocircuitado</w:t>
+      </w:r>
+    </w:p>
+    <w:p>
+      <w:pPr>
+        <w:pStyle w:val="Choice"/>
+      </w:pPr>
+      <w:r>
+        <w:t>c)</w:t>
+        <w:tab/>
         <w:t>O led -b- acenderá</w:t>
       </w:r>
     </w:p>
@@ -3771,29 +3791,9 @@
         <w:pStyle w:val="Choice"/>
       </w:pPr>
       <w:r>
-        <w:t>b)</w:t>
-        <w:tab/>
-        <w:t>O led -a- acenderá</w:t>
-      </w:r>
-    </w:p>
-    <w:p>
-      <w:pPr>
-        <w:pStyle w:val="Choice"/>
-      </w:pPr>
-      <w:r>
-        <w:t>c)</w:t>
+        <w:t>d)</w:t>
         <w:tab/>
         <w:t>A intensidade non pasará polo led -a- porque ten un camiño alternativo sen resistencia</w:t>
-      </w:r>
-    </w:p>
-    <w:p>
-      <w:pPr>
-        <w:pStyle w:val="Choice"/>
-      </w:pPr>
-      <w:r>
-        <w:t>d)</w:t>
-        <w:tab/>
-        <w:t>O led -a- está curtocircuitado</w:t>
       </w:r>
     </w:p>
     <w:p>
@@ -3850,6 +3850,16 @@
       <w:r>
         <w:t>a)</w:t>
         <w:tab/>
+        <w:t>Se cerro o interruptor 2 pasará corrente pola resistencia</w:t>
+      </w:r>
+    </w:p>
+    <w:p>
+      <w:pPr>
+        <w:pStyle w:val="Choice"/>
+      </w:pPr>
+      <w:r>
+        <w:t>b)</w:t>
+        <w:tab/>
         <w:t>Se cerro calquera dos dous interruptores, pasará corrente</w:t>
       </w:r>
     </w:p>
@@ -3858,29 +3868,19 @@
         <w:pStyle w:val="Choice"/>
       </w:pPr>
       <w:r>
-        <w:t>b)</w:t>
+        <w:t>c)</w:t>
+        <w:tab/>
+        <w:t>Só pasará corrente pola resistencia con 1 e 2 cerrados</w:t>
+      </w:r>
+    </w:p>
+    <w:p>
+      <w:pPr>
+        <w:pStyle w:val="Choice"/>
+      </w:pPr>
+      <w:r>
+        <w:t>d)</w:t>
         <w:tab/>
         <w:t>Se cerro o interruptor 1 pasará corrente pola resistencia</w:t>
-      </w:r>
-    </w:p>
-    <w:p>
-      <w:pPr>
-        <w:pStyle w:val="Choice"/>
-      </w:pPr>
-      <w:r>
-        <w:t>c)</w:t>
-        <w:tab/>
-        <w:t>Só pasará corrente pola resistencia con 1 e 2 cerrados</w:t>
-      </w:r>
-    </w:p>
-    <w:p>
-      <w:pPr>
-        <w:pStyle w:val="Choice"/>
-      </w:pPr>
-      <w:r>
-        <w:t>d)</w:t>
-        <w:tab/>
-        <w:t>Se cerro o interruptor 2 pasará corrente pola resistencia</w:t>
       </w:r>
     </w:p>
     <w:p>
@@ -3947,27 +3947,27 @@
       <w:r>
         <w:t>b)</w:t>
         <w:tab/>
+        <w:t>Cerrando o 2 ou o 1</w:t>
+      </w:r>
+    </w:p>
+    <w:p>
+      <w:pPr>
+        <w:pStyle w:val="Choice"/>
+      </w:pPr>
+      <w:r>
+        <w:t>c)</w:t>
+        <w:tab/>
+        <w:t>Cerrando o 2, independentemente de como estea 1</w:t>
+      </w:r>
+    </w:p>
+    <w:p>
+      <w:pPr>
+        <w:pStyle w:val="Choice"/>
+      </w:pPr>
+      <w:r>
+        <w:t>d)</w:t>
+        <w:tab/>
         <w:t>Só se 2 está cerrado e 1 abert</w:t>
-      </w:r>
-    </w:p>
-    <w:p>
-      <w:pPr>
-        <w:pStyle w:val="Choice"/>
-      </w:pPr>
-      <w:r>
-        <w:t>c)</w:t>
-        <w:tab/>
-        <w:t>Cerrando o 2 ou o 1</w:t>
-      </w:r>
-    </w:p>
-    <w:p>
-      <w:pPr>
-        <w:pStyle w:val="Choice"/>
-      </w:pPr>
-      <w:r>
-        <w:t>d)</w:t>
-        <w:tab/>
-        <w:t>Cerrando o 2, independentemente de como estea 1</w:t>
       </w:r>
     </w:p>
     <w:p>
@@ -4024,27 +4024,27 @@
       <w:r>
         <w:t>a)</w:t>
         <w:tab/>
+        <w:t>As dúas en serie</w:t>
+      </w:r>
+    </w:p>
+    <w:p>
+      <w:pPr>
+        <w:pStyle w:val="Choice"/>
+      </w:pPr>
+      <w:r>
+        <w:t>b)</w:t>
+        <w:tab/>
+        <w:t>1 en paralelo, 2 en serie</w:t>
+      </w:r>
+    </w:p>
+    <w:p>
+      <w:pPr>
+        <w:pStyle w:val="Choice"/>
+      </w:pPr>
+      <w:r>
+        <w:t>c)</w:t>
+        <w:tab/>
         <w:t>As dúas en paralelo</w:t>
-      </w:r>
-    </w:p>
-    <w:p>
-      <w:pPr>
-        <w:pStyle w:val="Choice"/>
-      </w:pPr>
-      <w:r>
-        <w:t>b)</w:t>
-        <w:tab/>
-        <w:t>As dúas en serie</w:t>
-      </w:r>
-    </w:p>
-    <w:p>
-      <w:pPr>
-        <w:pStyle w:val="Choice"/>
-      </w:pPr>
-      <w:r>
-        <w:t>c)</w:t>
-        <w:tab/>
-        <w:t>1 en paralelo, 2 en serie</w:t>
       </w:r>
     </w:p>
     <w:p>
@@ -4121,27 +4121,27 @@
       <w:r>
         <w:t>b)</w:t>
         <w:tab/>
+        <w:t>1 en serie, 2 en paralelo</w:t>
+      </w:r>
+    </w:p>
+    <w:p>
+      <w:pPr>
+        <w:pStyle w:val="Choice"/>
+      </w:pPr>
+      <w:r>
+        <w:t>c)</w:t>
+        <w:tab/>
+        <w:t>As dúas en serie</w:t>
+      </w:r>
+    </w:p>
+    <w:p>
+      <w:pPr>
+        <w:pStyle w:val="Choice"/>
+      </w:pPr>
+      <w:r>
+        <w:t>d)</w:t>
+        <w:tab/>
         <w:t>As dúas en paralelo</w:t>
-      </w:r>
-    </w:p>
-    <w:p>
-      <w:pPr>
-        <w:pStyle w:val="Choice"/>
-      </w:pPr>
-      <w:r>
-        <w:t>c)</w:t>
-        <w:tab/>
-        <w:t>As dúas en serie</w:t>
-      </w:r>
-    </w:p>
-    <w:p>
-      <w:pPr>
-        <w:pStyle w:val="Choice"/>
-      </w:pPr>
-      <w:r>
-        <w:t>d)</w:t>
-        <w:tab/>
-        <w:t>1 en serie, 2 en paralelo</w:t>
       </w:r>
     </w:p>
     <w:p>
@@ -4198,6 +4198,16 @@
       <w:r>
         <w:t>a)</w:t>
         <w:tab/>
+        <w:t>Por ningunha</w:t>
+      </w:r>
+    </w:p>
+    <w:p>
+      <w:pPr>
+        <w:pStyle w:val="Choice"/>
+      </w:pPr>
+      <w:r>
+        <w:t>b)</w:t>
+        <w:tab/>
         <w:t>Por 2 e 3</w:t>
       </w:r>
     </w:p>
@@ -4206,7 +4216,7 @@
         <w:pStyle w:val="Choice"/>
       </w:pPr>
       <w:r>
-        <w:t>b)</w:t>
+        <w:t>c)</w:t>
         <w:tab/>
         <w:t>Por todas</w:t>
       </w:r>
@@ -4216,19 +4226,9 @@
         <w:pStyle w:val="Choice"/>
       </w:pPr>
       <w:r>
-        <w:t>c)</w:t>
+        <w:t>d)</w:t>
         <w:tab/>
         <w:t>Por 1 e 2</w:t>
-      </w:r>
-    </w:p>
-    <w:p>
-      <w:pPr>
-        <w:pStyle w:val="Choice"/>
-      </w:pPr>
-      <w:r>
-        <w:t>d)</w:t>
-        <w:tab/>
-        <w:t>Por ningunha</w:t>
       </w:r>
     </w:p>
     <w:p>
@@ -4285,6 +4285,26 @@
       <w:r>
         <w:t>a)</w:t>
         <w:tab/>
+        <w:t>ningún</w:t>
+      </w:r>
+    </w:p>
+    <w:p>
+      <w:pPr>
+        <w:pStyle w:val="Choice"/>
+      </w:pPr>
+      <w:r>
+        <w:t>b)</w:t>
+        <w:tab/>
+        <w:t>1</w:t>
+      </w:r>
+    </w:p>
+    <w:p>
+      <w:pPr>
+        <w:pStyle w:val="Choice"/>
+      </w:pPr>
+      <w:r>
+        <w:t>c)</w:t>
+        <w:tab/>
         <w:t>3</w:t>
       </w:r>
     </w:p>
@@ -4293,29 +4313,9 @@
         <w:pStyle w:val="Choice"/>
       </w:pPr>
       <w:r>
-        <w:t>b)</w:t>
+        <w:t>d)</w:t>
         <w:tab/>
         <w:t>2</w:t>
-      </w:r>
-    </w:p>
-    <w:p>
-      <w:pPr>
-        <w:pStyle w:val="Choice"/>
-      </w:pPr>
-      <w:r>
-        <w:t>c)</w:t>
-        <w:tab/>
-        <w:t>ningún</w:t>
-      </w:r>
-    </w:p>
-    <w:p>
-      <w:pPr>
-        <w:pStyle w:val="Choice"/>
-      </w:pPr>
-      <w:r>
-        <w:t>d)</w:t>
-        <w:tab/>
-        <w:t>1</w:t>
       </w:r>
     </w:p>
     <w:p>
@@ -4372,27 +4372,27 @@
       <w:r>
         <w:t>a)</w:t>
         <w:tab/>
+        <w:t>Co interruptor 1 aberto, non acenderá nada</w:t>
+      </w:r>
+    </w:p>
+    <w:p>
+      <w:pPr>
+        <w:pStyle w:val="Choice"/>
+      </w:pPr>
+      <w:r>
+        <w:t>b)</w:t>
+        <w:tab/>
+        <w:t>Cos dous interruptores premidos, acenden todos os leds</w:t>
+      </w:r>
+    </w:p>
+    <w:p>
+      <w:pPr>
+        <w:pStyle w:val="Choice"/>
+      </w:pPr>
+      <w:r>
+        <w:t>c)</w:t>
+        <w:tab/>
         <w:t>Podo acender -c- sen acender -a- e -b-</w:t>
-      </w:r>
-    </w:p>
-    <w:p>
-      <w:pPr>
-        <w:pStyle w:val="Choice"/>
-      </w:pPr>
-      <w:r>
-        <w:t>b)</w:t>
-        <w:tab/>
-        <w:t>Co interruptor 1 aberto, non acenderá nada</w:t>
-      </w:r>
-    </w:p>
-    <w:p>
-      <w:pPr>
-        <w:pStyle w:val="Choice"/>
-      </w:pPr>
-      <w:r>
-        <w:t>c)</w:t>
-        <w:tab/>
-        <w:t>Cos dous interruptores premidos, acenden todos os leds</w:t>
       </w:r>
     </w:p>
     <w:p>
@@ -4459,6 +4459,16 @@
       <w:r>
         <w:t>a)</w:t>
         <w:tab/>
+        <w:t>Se teño premidos os dous pulsadores</w:t>
+      </w:r>
+    </w:p>
+    <w:p>
+      <w:pPr>
+        <w:pStyle w:val="Choice"/>
+      </w:pPr>
+      <w:r>
+        <w:t>b)</w:t>
+        <w:tab/>
         <w:t>Se premo o pulsador da esquerda</w:t>
       </w:r>
     </w:p>
@@ -4467,29 +4477,19 @@
         <w:pStyle w:val="Choice"/>
       </w:pPr>
       <w:r>
-        <w:t>b)</w:t>
+        <w:t>c)</w:t>
+        <w:tab/>
+        <w:t>Se premo o pulsador da dereita</w:t>
+      </w:r>
+    </w:p>
+    <w:p>
+      <w:pPr>
+        <w:pStyle w:val="Choice"/>
+      </w:pPr>
+      <w:r>
+        <w:t>d)</w:t>
         <w:tab/>
         <w:t>En ningún caso</w:t>
-      </w:r>
-    </w:p>
-    <w:p>
-      <w:pPr>
-        <w:pStyle w:val="Choice"/>
-      </w:pPr>
-      <w:r>
-        <w:t>c)</w:t>
-        <w:tab/>
-        <w:t>Se premo o pulsador da dereita</w:t>
-      </w:r>
-    </w:p>
-    <w:p>
-      <w:pPr>
-        <w:pStyle w:val="Choice"/>
-      </w:pPr>
-      <w:r>
-        <w:t>d)</w:t>
-        <w:tab/>
-        <w:t>Se teño premidos os dous pulsadores</w:t>
       </w:r>
     </w:p>
     <w:p>
@@ -4546,37 +4546,37 @@
       <w:r>
         <w:t>a)</w:t>
         <w:tab/>
+        <w:t>O led vermello acende cando premo o pulsador da dereita</w:t>
+      </w:r>
+    </w:p>
+    <w:p>
+      <w:pPr>
+        <w:pStyle w:val="Choice"/>
+      </w:pPr>
+      <w:r>
+        <w:t>b)</w:t>
+        <w:tab/>
+        <w:t>Para acender o led verde teño que ter premido o pulsador da dereita</w:t>
+      </w:r>
+    </w:p>
+    <w:p>
+      <w:pPr>
+        <w:pStyle w:val="Choice"/>
+      </w:pPr>
+      <w:r>
+        <w:t>c)</w:t>
+        <w:tab/>
+        <w:t>Para acender o led verde teño que ter premido o pulsador da esquerda</w:t>
+      </w:r>
+    </w:p>
+    <w:p>
+      <w:pPr>
+        <w:pStyle w:val="Choice"/>
+      </w:pPr>
+      <w:r>
+        <w:t>d)</w:t>
+        <w:tab/>
         <w:t>Podo acender o led verde sen que acenda o led vermello</w:t>
-      </w:r>
-    </w:p>
-    <w:p>
-      <w:pPr>
-        <w:pStyle w:val="Choice"/>
-      </w:pPr>
-      <w:r>
-        <w:t>b)</w:t>
-        <w:tab/>
-        <w:t>O led vermello acende cando premo o pulsador da dereita</w:t>
-      </w:r>
-    </w:p>
-    <w:p>
-      <w:pPr>
-        <w:pStyle w:val="Choice"/>
-      </w:pPr>
-      <w:r>
-        <w:t>c)</w:t>
-        <w:tab/>
-        <w:t>Para acender o led verde teño que ter premido o pulsador da dereita</w:t>
-      </w:r>
-    </w:p>
-    <w:p>
-      <w:pPr>
-        <w:pStyle w:val="Choice"/>
-      </w:pPr>
-      <w:r>
-        <w:t>d)</w:t>
-        <w:tab/>
-        <w:t>Para acender o led verde teño que ter premido o pulsador da esquerda</w:t>
       </w:r>
     </w:p>
     <w:p>
@@ -4643,17 +4643,17 @@
       <w:r>
         <w:t>b)</w:t>
         <w:tab/>
+        <w:t>Ao azul</w:t>
+      </w:r>
+    </w:p>
+    <w:p>
+      <w:pPr>
+        <w:pStyle w:val="Choice"/>
+      </w:pPr>
+      <w:r>
+        <w:t>c)</w:t>
+        <w:tab/>
         <w:t>Ao laranxa</w:t>
-      </w:r>
-    </w:p>
-    <w:p>
-      <w:pPr>
-        <w:pStyle w:val="Choice"/>
-      </w:pPr>
-      <w:r>
-        <w:t>c)</w:t>
-        <w:tab/>
-        <w:t>Ao azul</w:t>
       </w:r>
     </w:p>
     <w:p>
@@ -4720,37 +4720,37 @@
       <w:r>
         <w:t>a)</w:t>
         <w:tab/>
+        <w:t>O led non acenderá cando  -b- estea aberto</w:t>
+      </w:r>
+    </w:p>
+    <w:p>
+      <w:pPr>
+        <w:pStyle w:val="Choice"/>
+      </w:pPr>
+      <w:r>
+        <w:t>b)</w:t>
+        <w:tab/>
+        <w:t>O led acenderá cando prema os dous interruptores</w:t>
+      </w:r>
+    </w:p>
+    <w:p>
+      <w:pPr>
+        <w:pStyle w:val="Choice"/>
+      </w:pPr>
+      <w:r>
+        <w:t>c)</w:t>
+        <w:tab/>
+        <w:t>O led acenderá se unicamente está pechado  -a-</w:t>
+      </w:r>
+    </w:p>
+    <w:p>
+      <w:pPr>
+        <w:pStyle w:val="Choice"/>
+      </w:pPr>
+      <w:r>
+        <w:t>d)</w:t>
+        <w:tab/>
         <w:t>O led acenderá ao premer -a-, estea como estea -b-</w:t>
-      </w:r>
-    </w:p>
-    <w:p>
-      <w:pPr>
-        <w:pStyle w:val="Choice"/>
-      </w:pPr>
-      <w:r>
-        <w:t>b)</w:t>
-        <w:tab/>
-        <w:t>O led acenderá se unicamente está pechado  -a-</w:t>
-      </w:r>
-    </w:p>
-    <w:p>
-      <w:pPr>
-        <w:pStyle w:val="Choice"/>
-      </w:pPr>
-      <w:r>
-        <w:t>c)</w:t>
-        <w:tab/>
-        <w:t>O led non acenderá cando  -b- estea aberto</w:t>
-      </w:r>
-    </w:p>
-    <w:p>
-      <w:pPr>
-        <w:pStyle w:val="Choice"/>
-      </w:pPr>
-      <w:r>
-        <w:t>d)</w:t>
-        <w:tab/>
-        <w:t>O led acenderá cando prema os dous interruptores</w:t>
       </w:r>
     </w:p>
     <w:p>
@@ -4807,6 +4807,26 @@
       <w:r>
         <w:t>a)</w:t>
         <w:tab/>
+        <w:t>Ningún</w:t>
+      </w:r>
+    </w:p>
+    <w:p>
+      <w:pPr>
+        <w:pStyle w:val="Choice"/>
+      </w:pPr>
+      <w:r>
+        <w:t>b)</w:t>
+        <w:tab/>
+        <w:t>O 3 e o 4</w:t>
+      </w:r>
+    </w:p>
+    <w:p>
+      <w:pPr>
+        <w:pStyle w:val="Choice"/>
+      </w:pPr>
+      <w:r>
+        <w:t>c)</w:t>
+        <w:tab/>
         <w:t>O 2,3,4 e 6</w:t>
       </w:r>
     </w:p>
@@ -4815,29 +4835,9 @@
         <w:pStyle w:val="Choice"/>
       </w:pPr>
       <w:r>
-        <w:t>b)</w:t>
-        <w:tab/>
-        <w:t>O 3 e o 4</w:t>
-      </w:r>
-    </w:p>
-    <w:p>
-      <w:pPr>
-        <w:pStyle w:val="Choice"/>
-      </w:pPr>
-      <w:r>
-        <w:t>c)</w:t>
+        <w:t>d)</w:t>
         <w:tab/>
         <w:t>O 1 e o 5</w:t>
-      </w:r>
-    </w:p>
-    <w:p>
-      <w:pPr>
-        <w:pStyle w:val="Choice"/>
-      </w:pPr>
-      <w:r>
-        <w:t>d)</w:t>
-        <w:tab/>
-        <w:t>Ningún</w:t>
       </w:r>
     </w:p>
     <w:p>
@@ -4894,37 +4894,37 @@
       <w:r>
         <w:t>a)</w:t>
         <w:tab/>
+        <w:t>O 1, 3, 4 e 6</w:t>
+      </w:r>
+    </w:p>
+    <w:p>
+      <w:pPr>
+        <w:pStyle w:val="Choice"/>
+      </w:pPr>
+      <w:r>
+        <w:t>b)</w:t>
+        <w:tab/>
+        <w:t>O 1 e o 3</w:t>
+      </w:r>
+    </w:p>
+    <w:p>
+      <w:pPr>
+        <w:pStyle w:val="Choice"/>
+      </w:pPr>
+      <w:r>
+        <w:t>c)</w:t>
+        <w:tab/>
+        <w:t>Todos</w:t>
+      </w:r>
+    </w:p>
+    <w:p>
+      <w:pPr>
+        <w:pStyle w:val="Choice"/>
+      </w:pPr>
+      <w:r>
+        <w:t>d)</w:t>
+        <w:tab/>
         <w:t>Ningún</w:t>
-      </w:r>
-    </w:p>
-    <w:p>
-      <w:pPr>
-        <w:pStyle w:val="Choice"/>
-      </w:pPr>
-      <w:r>
-        <w:t>b)</w:t>
-        <w:tab/>
-        <w:t>O 1, 3, 4 e 6</w:t>
-      </w:r>
-    </w:p>
-    <w:p>
-      <w:pPr>
-        <w:pStyle w:val="Choice"/>
-      </w:pPr>
-      <w:r>
-        <w:t>c)</w:t>
-        <w:tab/>
-        <w:t>Todos</w:t>
-      </w:r>
-    </w:p>
-    <w:p>
-      <w:pPr>
-        <w:pStyle w:val="Choice"/>
-      </w:pPr>
-      <w:r>
-        <w:t>d)</w:t>
-        <w:tab/>
-        <w:t>O 1 e o 3</w:t>
       </w:r>
     </w:p>
     <w:p>
@@ -4981,6 +4981,16 @@
       <w:r>
         <w:t>a)</w:t>
         <w:tab/>
+        <w:t>Todos</w:t>
+      </w:r>
+    </w:p>
+    <w:p>
+      <w:pPr>
+        <w:pStyle w:val="Choice"/>
+      </w:pPr>
+      <w:r>
+        <w:t>b)</w:t>
+        <w:tab/>
         <w:t>Ningún</w:t>
       </w:r>
     </w:p>
@@ -4989,7 +4999,7 @@
         <w:pStyle w:val="Choice"/>
       </w:pPr>
       <w:r>
-        <w:t>b)</w:t>
+        <w:t>c)</w:t>
         <w:tab/>
         <w:t>O 3</w:t>
       </w:r>
@@ -4999,19 +5009,9 @@
         <w:pStyle w:val="Choice"/>
       </w:pPr>
       <w:r>
-        <w:t>c)</w:t>
+        <w:t>d)</w:t>
         <w:tab/>
         <w:t>O 2 e o 3</w:t>
-      </w:r>
-    </w:p>
-    <w:p>
-      <w:pPr>
-        <w:pStyle w:val="Choice"/>
-      </w:pPr>
-      <w:r>
-        <w:t>d)</w:t>
-        <w:tab/>
-        <w:t>Todos</w:t>
       </w:r>
     </w:p>
     <w:p>
@@ -5088,17 +5088,17 @@
       <w:r>
         <w:t>c)</w:t>
         <w:tab/>
+        <w:t>O 1, 3 e 4</w:t>
+      </w:r>
+    </w:p>
+    <w:p>
+      <w:pPr>
+        <w:pStyle w:val="Choice"/>
+      </w:pPr>
+      <w:r>
+        <w:t>d)</w:t>
+        <w:tab/>
         <w:t>O 4</w:t>
-      </w:r>
-    </w:p>
-    <w:p>
-      <w:pPr>
-        <w:pStyle w:val="Choice"/>
-      </w:pPr>
-      <w:r>
-        <w:t>d)</w:t>
-        <w:tab/>
-        <w:t>O 1, 3 e 4</w:t>
       </w:r>
     </w:p>
     <w:p>
@@ -5175,17 +5175,17 @@
       <w:r>
         <w:t>c)</w:t>
         <w:tab/>
+        <w:t>O led está posto do revés</w:t>
+      </w:r>
+    </w:p>
+    <w:p>
+      <w:pPr>
+        <w:pStyle w:val="Choice"/>
+      </w:pPr>
+      <w:r>
+        <w:t>d)</w:t>
+        <w:tab/>
         <w:t>Non hai fallos, vai acender</w:t>
-      </w:r>
-    </w:p>
-    <w:p>
-      <w:pPr>
-        <w:pStyle w:val="Choice"/>
-      </w:pPr>
-      <w:r>
-        <w:t>d)</w:t>
-        <w:tab/>
-        <w:t>O led está posto do revés</w:t>
       </w:r>
     </w:p>
     <w:p>
@@ -5242,27 +5242,27 @@
       <w:r>
         <w:t>a)</w:t>
         <w:tab/>
+        <w:t>O cable verde non conecta os terminais correctos dos interruptores</w:t>
+      </w:r>
+    </w:p>
+    <w:p>
+      <w:pPr>
+        <w:pStyle w:val="Choice"/>
+      </w:pPr>
+      <w:r>
+        <w:t>b)</w:t>
+        <w:tab/>
+        <w:t>A resistencia non está conectada no terminal correcto do pulsador</w:t>
+      </w:r>
+    </w:p>
+    <w:p>
+      <w:pPr>
+        <w:pStyle w:val="Choice"/>
+      </w:pPr>
+      <w:r>
+        <w:t>c)</w:t>
+        <w:tab/>
         <w:t>O led acenderá cando prema calquera dos interruptores</w:t>
-      </w:r>
-    </w:p>
-    <w:p>
-      <w:pPr>
-        <w:pStyle w:val="Choice"/>
-      </w:pPr>
-      <w:r>
-        <w:t>b)</w:t>
-        <w:tab/>
-        <w:t>O cable verde non conecta os terminais correctos dos interruptores</w:t>
-      </w:r>
-    </w:p>
-    <w:p>
-      <w:pPr>
-        <w:pStyle w:val="Choice"/>
-      </w:pPr>
-      <w:r>
-        <w:t>c)</w:t>
-        <w:tab/>
-        <w:t>A resistencia non está conectada no terminal correcto do pulsador</w:t>
       </w:r>
     </w:p>
     <w:p>
@@ -5329,37 +5329,37 @@
       <w:r>
         <w:t>a)</w:t>
         <w:tab/>
+        <w:t>O verde</w:t>
+      </w:r>
+    </w:p>
+    <w:p>
+      <w:pPr>
+        <w:pStyle w:val="Choice"/>
+      </w:pPr>
+      <w:r>
+        <w:t>b)</w:t>
+        <w:tab/>
+        <w:t>O amarelo</w:t>
+      </w:r>
+    </w:p>
+    <w:p>
+      <w:pPr>
+        <w:pStyle w:val="Choice"/>
+      </w:pPr>
+      <w:r>
+        <w:t>c)</w:t>
+        <w:tab/>
+        <w:t>O azul</w:t>
+      </w:r>
+    </w:p>
+    <w:p>
+      <w:pPr>
+        <w:pStyle w:val="Choice"/>
+      </w:pPr>
+      <w:r>
+        <w:t>d)</w:t>
+        <w:tab/>
         <w:t>O laranxa</w:t>
-      </w:r>
-    </w:p>
-    <w:p>
-      <w:pPr>
-        <w:pStyle w:val="Choice"/>
-      </w:pPr>
-      <w:r>
-        <w:t>b)</w:t>
-        <w:tab/>
-        <w:t>O verde</w:t>
-      </w:r>
-    </w:p>
-    <w:p>
-      <w:pPr>
-        <w:pStyle w:val="Choice"/>
-      </w:pPr>
-      <w:r>
-        <w:t>c)</w:t>
-        <w:tab/>
-        <w:t>O amarelo</w:t>
-      </w:r>
-    </w:p>
-    <w:p>
-      <w:pPr>
-        <w:pStyle w:val="Choice"/>
-      </w:pPr>
-      <w:r>
-        <w:t>d)</w:t>
-        <w:tab/>
-        <w:t>O azul</w:t>
       </w:r>
     </w:p>
     <w:p>
@@ -5416,6 +5416,26 @@
       <w:r>
         <w:t>a)</w:t>
         <w:tab/>
+        <w:t>Polo 2</w:t>
+      </w:r>
+    </w:p>
+    <w:p>
+      <w:pPr>
+        <w:pStyle w:val="Choice"/>
+      </w:pPr>
+      <w:r>
+        <w:t>b)</w:t>
+        <w:tab/>
+        <w:t>Polo 1</w:t>
+      </w:r>
+    </w:p>
+    <w:p>
+      <w:pPr>
+        <w:pStyle w:val="Choice"/>
+      </w:pPr>
+      <w:r>
+        <w:t>c)</w:t>
+        <w:tab/>
         <w:t>Polo 4</w:t>
       </w:r>
     </w:p>
@@ -5424,29 +5444,9 @@
         <w:pStyle w:val="Choice"/>
       </w:pPr>
       <w:r>
-        <w:t>b)</w:t>
-        <w:tab/>
-        <w:t>Polo 2</w:t>
-      </w:r>
-    </w:p>
-    <w:p>
-      <w:pPr>
-        <w:pStyle w:val="Choice"/>
-      </w:pPr>
-      <w:r>
-        <w:t>c)</w:t>
+        <w:t>d)</w:t>
         <w:tab/>
         <w:t>Polo 3</w:t>
-      </w:r>
-    </w:p>
-    <w:p>
-      <w:pPr>
-        <w:pStyle w:val="Choice"/>
-      </w:pPr>
-      <w:r>
-        <w:t>d)</w:t>
-        <w:tab/>
-        <w:t>Polo 1</w:t>
       </w:r>
     </w:p>
     <w:p>
@@ -5503,6 +5503,26 @@
       <w:r>
         <w:t>a)</w:t>
         <w:tab/>
+        <w:t>Polo 4</w:t>
+      </w:r>
+    </w:p>
+    <w:p>
+      <w:pPr>
+        <w:pStyle w:val="Choice"/>
+      </w:pPr>
+      <w:r>
+        <w:t>b)</w:t>
+        <w:tab/>
+        <w:t>Polo 1</w:t>
+      </w:r>
+    </w:p>
+    <w:p>
+      <w:pPr>
+        <w:pStyle w:val="Choice"/>
+      </w:pPr>
+      <w:r>
+        <w:t>c)</w:t>
+        <w:tab/>
         <w:t>Polo 3</w:t>
       </w:r>
     </w:p>
@@ -5511,29 +5531,9 @@
         <w:pStyle w:val="Choice"/>
       </w:pPr>
       <w:r>
-        <w:t>b)</w:t>
-        <w:tab/>
-        <w:t>Polo 4</w:t>
-      </w:r>
-    </w:p>
-    <w:p>
-      <w:pPr>
-        <w:pStyle w:val="Choice"/>
-      </w:pPr>
-      <w:r>
-        <w:t>c)</w:t>
+        <w:t>d)</w:t>
         <w:tab/>
         <w:t>Polo 2</w:t>
-      </w:r>
-    </w:p>
-    <w:p>
-      <w:pPr>
-        <w:pStyle w:val="Choice"/>
-      </w:pPr>
-      <w:r>
-        <w:t>d)</w:t>
-        <w:tab/>
-        <w:t>Polo 1</w:t>
       </w:r>
     </w:p>
     <w:p>
@@ -5590,6 +5590,16 @@
       <w:r>
         <w:t>a)</w:t>
         <w:tab/>
+        <w:t>Polo 1</w:t>
+      </w:r>
+    </w:p>
+    <w:p>
+      <w:pPr>
+        <w:pStyle w:val="Choice"/>
+      </w:pPr>
+      <w:r>
+        <w:t>b)</w:t>
+        <w:tab/>
         <w:t>Polo 3</w:t>
       </w:r>
     </w:p>
@@ -5598,29 +5608,19 @@
         <w:pStyle w:val="Choice"/>
       </w:pPr>
       <w:r>
-        <w:t>b)</w:t>
-        <w:tab/>
-        <w:t>Polo 1</w:t>
-      </w:r>
-    </w:p>
-    <w:p>
-      <w:pPr>
-        <w:pStyle w:val="Choice"/>
-      </w:pPr>
-      <w:r>
         <w:t>c)</w:t>
         <w:tab/>
+        <w:t>Polo 2</w:t>
+      </w:r>
+    </w:p>
+    <w:p>
+      <w:pPr>
+        <w:pStyle w:val="Choice"/>
+      </w:pPr>
+      <w:r>
+        <w:t>d)</w:t>
+        <w:tab/>
         <w:t>Polo 4</w:t>
-      </w:r>
-    </w:p>
-    <w:p>
-      <w:pPr>
-        <w:pStyle w:val="Choice"/>
-      </w:pPr>
-      <w:r>
-        <w:t>d)</w:t>
-        <w:tab/>
-        <w:t>Polo 2</w:t>
       </w:r>
     </w:p>
     <w:p>
@@ -5677,37 +5677,37 @@
       <w:r>
         <w:t>a)</w:t>
         <w:tab/>
+        <w:t>Polo 2</w:t>
+      </w:r>
+    </w:p>
+    <w:p>
+      <w:pPr>
+        <w:pStyle w:val="Choice"/>
+      </w:pPr>
+      <w:r>
+        <w:t>b)</w:t>
+        <w:tab/>
+        <w:t>Polo 4</w:t>
+      </w:r>
+    </w:p>
+    <w:p>
+      <w:pPr>
+        <w:pStyle w:val="Choice"/>
+      </w:pPr>
+      <w:r>
+        <w:t>c)</w:t>
+        <w:tab/>
+        <w:t>Polo 3</w:t>
+      </w:r>
+    </w:p>
+    <w:p>
+      <w:pPr>
+        <w:pStyle w:val="Choice"/>
+      </w:pPr>
+      <w:r>
+        <w:t>d)</w:t>
+        <w:tab/>
         <w:t>Polo 1</w:t>
-      </w:r>
-    </w:p>
-    <w:p>
-      <w:pPr>
-        <w:pStyle w:val="Choice"/>
-      </w:pPr>
-      <w:r>
-        <w:t>b)</w:t>
-        <w:tab/>
-        <w:t>Polo 3</w:t>
-      </w:r>
-    </w:p>
-    <w:p>
-      <w:pPr>
-        <w:pStyle w:val="Choice"/>
-      </w:pPr>
-      <w:r>
-        <w:t>c)</w:t>
-        <w:tab/>
-        <w:t>Polo 4</w:t>
-      </w:r>
-    </w:p>
-    <w:p>
-      <w:pPr>
-        <w:pStyle w:val="Choice"/>
-      </w:pPr>
-      <w:r>
-        <w:t>d)</w:t>
-        <w:tab/>
-        <w:t>Polo 2</w:t>
       </w:r>
     </w:p>
     <w:p>
@@ -5764,37 +5764,37 @@
       <w:r>
         <w:t>a)</w:t>
         <w:tab/>
+        <w:t>Polo 2</w:t>
+      </w:r>
+    </w:p>
+    <w:p>
+      <w:pPr>
+        <w:pStyle w:val="Choice"/>
+      </w:pPr>
+      <w:r>
+        <w:t>b)</w:t>
+        <w:tab/>
+        <w:t>Polo 4</w:t>
+      </w:r>
+    </w:p>
+    <w:p>
+      <w:pPr>
+        <w:pStyle w:val="Choice"/>
+      </w:pPr>
+      <w:r>
+        <w:t>c)</w:t>
+        <w:tab/>
+        <w:t>Polo 3</w:t>
+      </w:r>
+    </w:p>
+    <w:p>
+      <w:pPr>
+        <w:pStyle w:val="Choice"/>
+      </w:pPr>
+      <w:r>
+        <w:t>d)</w:t>
+        <w:tab/>
         <w:t>Polo 1</w:t>
-      </w:r>
-    </w:p>
-    <w:p>
-      <w:pPr>
-        <w:pStyle w:val="Choice"/>
-      </w:pPr>
-      <w:r>
-        <w:t>b)</w:t>
-        <w:tab/>
-        <w:t>Polo 2</w:t>
-      </w:r>
-    </w:p>
-    <w:p>
-      <w:pPr>
-        <w:pStyle w:val="Choice"/>
-      </w:pPr>
-      <w:r>
-        <w:t>c)</w:t>
-        <w:tab/>
-        <w:t>Polo 4</w:t>
-      </w:r>
-    </w:p>
-    <w:p>
-      <w:pPr>
-        <w:pStyle w:val="Choice"/>
-      </w:pPr>
-      <w:r>
-        <w:t>d)</w:t>
-        <w:tab/>
-        <w:t>Polo 3</w:t>
       </w:r>
     </w:p>
     <w:p>
@@ -5851,6 +5851,16 @@
       <w:r>
         <w:t>a)</w:t>
         <w:tab/>
+        <w:t>A voltaxe á que está sometida -a- disminuirá</w:t>
+      </w:r>
+    </w:p>
+    <w:p>
+      <w:pPr>
+        <w:pStyle w:val="Choice"/>
+      </w:pPr>
+      <w:r>
+        <w:t>b)</w:t>
+        <w:tab/>
         <w:t>A intensidade total do circuíto non variará</w:t>
       </w:r>
     </w:p>
@@ -5859,7 +5869,7 @@
         <w:pStyle w:val="Choice"/>
       </w:pPr>
       <w:r>
-        <w:t>b)</w:t>
+        <w:t>c)</w:t>
         <w:tab/>
         <w:t>A intensidade total do circuíto aumentará</w:t>
       </w:r>
@@ -5869,19 +5879,9 @@
         <w:pStyle w:val="Choice"/>
       </w:pPr>
       <w:r>
-        <w:t>c)</w:t>
+        <w:t>d)</w:t>
         <w:tab/>
         <w:t>A intensidade total do circuíto disminuirá</w:t>
-      </w:r>
-    </w:p>
-    <w:p>
-      <w:pPr>
-        <w:pStyle w:val="Choice"/>
-      </w:pPr>
-      <w:r>
-        <w:t>d)</w:t>
-        <w:tab/>
-        <w:t>A voltaxe á que está sometida -a- disminuirá</w:t>
       </w:r>
     </w:p>
     <w:p>
@@ -5948,27 +5948,27 @@
       <w:r>
         <w:t>b)</w:t>
         <w:tab/>
+        <w:t>Por -b- pasará a mesma intensidade que por -a-</w:t>
+      </w:r>
+    </w:p>
+    <w:p>
+      <w:pPr>
+        <w:pStyle w:val="Choice"/>
+      </w:pPr>
+      <w:r>
+        <w:t>c)</w:t>
+        <w:tab/>
+        <w:t>A intensidade total do circuíto non variará</w:t>
+      </w:r>
+    </w:p>
+    <w:p>
+      <w:pPr>
+        <w:pStyle w:val="Choice"/>
+      </w:pPr>
+      <w:r>
+        <w:t>d)</w:t>
+        <w:tab/>
         <w:t>A voltaxe de -a- será a metade que antes</w:t>
-      </w:r>
-    </w:p>
-    <w:p>
-      <w:pPr>
-        <w:pStyle w:val="Choice"/>
-      </w:pPr>
-      <w:r>
-        <w:t>c)</w:t>
-        <w:tab/>
-        <w:t>Por -b- pasará a mesma intensidade que por -a-</w:t>
-      </w:r>
-    </w:p>
-    <w:p>
-      <w:pPr>
-        <w:pStyle w:val="Choice"/>
-      </w:pPr>
-      <w:r>
-        <w:t>d)</w:t>
-        <w:tab/>
-        <w:t>A intensidade total do circuíto non variará</w:t>
       </w:r>
     </w:p>
     <w:p>
@@ -6025,17 +6025,17 @@
       <w:r>
         <w:t>a)</w:t>
         <w:tab/>
+        <w:t>Por -b- pasará unha itensidade igual á que pasa por -a-</w:t>
+      </w:r>
+    </w:p>
+    <w:p>
+      <w:pPr>
+        <w:pStyle w:val="Choice"/>
+      </w:pPr>
+      <w:r>
+        <w:t>b)</w:t>
+        <w:tab/>
         <w:t>A intensidade total disminuirá</w:t>
-      </w:r>
-    </w:p>
-    <w:p>
-      <w:pPr>
-        <w:pStyle w:val="Choice"/>
-      </w:pPr>
-      <w:r>
-        <w:t>b)</w:t>
-        <w:tab/>
-        <w:t>Por -b- pasará unha itensidade igual á que pasa por -a-</w:t>
       </w:r>
     </w:p>
     <w:p>
@@ -6122,17 +6122,17 @@
       <w:r>
         <w:t>b)</w:t>
         <w:tab/>
+        <w:t>O led acenderá se premo o pulsador dereito</w:t>
+      </w:r>
+    </w:p>
+    <w:p>
+      <w:pPr>
+        <w:pStyle w:val="Choice"/>
+      </w:pPr>
+      <w:r>
+        <w:t>c)</w:t>
+        <w:tab/>
         <w:t>O led non acenderá nunca</w:t>
-      </w:r>
-    </w:p>
-    <w:p>
-      <w:pPr>
-        <w:pStyle w:val="Choice"/>
-      </w:pPr>
-      <w:r>
-        <w:t>c)</w:t>
-        <w:tab/>
-        <w:t>O led acenderá se premo o pulsador dereito</w:t>
       </w:r>
     </w:p>
     <w:p>
@@ -6219,17 +6219,17 @@
       <w:r>
         <w:t>c)</w:t>
         <w:tab/>
+        <w:t>O azul e o vermello</w:t>
+      </w:r>
+    </w:p>
+    <w:p>
+      <w:pPr>
+        <w:pStyle w:val="Choice"/>
+      </w:pPr>
+      <w:r>
+        <w:t>d)</w:t>
+        <w:tab/>
         <w:t>O vermello</w:t>
-      </w:r>
-    </w:p>
-    <w:p>
-      <w:pPr>
-        <w:pStyle w:val="Choice"/>
-      </w:pPr>
-      <w:r>
-        <w:t>d)</w:t>
-        <w:tab/>
-        <w:t>O azul e o vermello</w:t>
       </w:r>
     </w:p>
     <w:p>
@@ -6286,37 +6286,37 @@
       <w:r>
         <w:t>a)</w:t>
         <w:tab/>
+        <w:t>Cada o interruptor acende un led</w:t>
+      </w:r>
+    </w:p>
+    <w:p>
+      <w:pPr>
+        <w:pStyle w:val="Choice"/>
+      </w:pPr>
+      <w:r>
+        <w:t>b)</w:t>
+        <w:tab/>
+        <w:t>O verde está sempre aceso, aínda que non prema ningún pulsador</w:t>
+      </w:r>
+    </w:p>
+    <w:p>
+      <w:pPr>
+        <w:pStyle w:val="Choice"/>
+      </w:pPr>
+      <w:r>
+        <w:t>c)</w:t>
+        <w:tab/>
+        <w:t>Se premo o pulsador da dereita, acenden os dous leds</w:t>
+      </w:r>
+    </w:p>
+    <w:p>
+      <w:pPr>
+        <w:pStyle w:val="Choice"/>
+      </w:pPr>
+      <w:r>
+        <w:t>d)</w:t>
+        <w:tab/>
         <w:t>Non poderei acender o led verde se non premo o interruptor da dereita</w:t>
-      </w:r>
-    </w:p>
-    <w:p>
-      <w:pPr>
-        <w:pStyle w:val="Choice"/>
-      </w:pPr>
-      <w:r>
-        <w:t>b)</w:t>
-        <w:tab/>
-        <w:t>Se premo o pulsador da dereita, acenden os dous leds</w:t>
-      </w:r>
-    </w:p>
-    <w:p>
-      <w:pPr>
-        <w:pStyle w:val="Choice"/>
-      </w:pPr>
-      <w:r>
-        <w:t>c)</w:t>
-        <w:tab/>
-        <w:t>O verde está sempre aceso, aínda que non prema ningún pulsador</w:t>
-      </w:r>
-    </w:p>
-    <w:p>
-      <w:pPr>
-        <w:pStyle w:val="Choice"/>
-      </w:pPr>
-      <w:r>
-        <w:t>d)</w:t>
-        <w:tab/>
-        <w:t>Cada o interruptor acende un led</w:t>
       </w:r>
     </w:p>
     <w:p>
@@ -6373,37 +6373,37 @@
       <w:r>
         <w:t>a)</w:t>
         <w:tab/>
+        <w:t>Con 1 pechado, 2 pechado e 3 aberto</w:t>
+      </w:r>
+    </w:p>
+    <w:p>
+      <w:pPr>
+        <w:pStyle w:val="Choice"/>
+      </w:pPr>
+      <w:r>
+        <w:t>b)</w:t>
+        <w:tab/>
+        <w:t>Con 1 pechado, 2 aberto e 3 aberto</w:t>
+      </w:r>
+    </w:p>
+    <w:p>
+      <w:pPr>
+        <w:pStyle w:val="Choice"/>
+      </w:pPr>
+      <w:r>
+        <w:t>c)</w:t>
+        <w:tab/>
+        <w:t>Con 1 pechado, 2 aberto e 3 pechado</w:t>
+      </w:r>
+    </w:p>
+    <w:p>
+      <w:pPr>
+        <w:pStyle w:val="Choice"/>
+      </w:pPr>
+      <w:r>
+        <w:t>d)</w:t>
+        <w:tab/>
         <w:t>Sempre que estea pechado o interruptor 1</w:t>
-      </w:r>
-    </w:p>
-    <w:p>
-      <w:pPr>
-        <w:pStyle w:val="Choice"/>
-      </w:pPr>
-      <w:r>
-        <w:t>b)</w:t>
-        <w:tab/>
-        <w:t>Con 1 pechado, 2 pechado e 3 aberto</w:t>
-      </w:r>
-    </w:p>
-    <w:p>
-      <w:pPr>
-        <w:pStyle w:val="Choice"/>
-      </w:pPr>
-      <w:r>
-        <w:t>c)</w:t>
-        <w:tab/>
-        <w:t>Con 1 pechado, 2 aberto e 3 pechado</w:t>
-      </w:r>
-    </w:p>
-    <w:p>
-      <w:pPr>
-        <w:pStyle w:val="Choice"/>
-      </w:pPr>
-      <w:r>
-        <w:t>d)</w:t>
-        <w:tab/>
-        <w:t>Con 1 pechado, 2 aberto e 3 aberto</w:t>
       </w:r>
     </w:p>
     <w:p>
@@ -6460,27 +6460,27 @@
       <w:r>
         <w:t>a)</w:t>
         <w:tab/>
+        <w:t>Si, premendo 1 e 3</w:t>
+      </w:r>
+    </w:p>
+    <w:p>
+      <w:pPr>
+        <w:pStyle w:val="Choice"/>
+      </w:pPr>
+      <w:r>
+        <w:t>b)</w:t>
+        <w:tab/>
+        <w:t>Si,premendo 1 e 2</w:t>
+      </w:r>
+    </w:p>
+    <w:p>
+      <w:pPr>
+        <w:pStyle w:val="Choice"/>
+      </w:pPr>
+      <w:r>
+        <w:t>c)</w:t>
+        <w:tab/>
         <w:t>Non</w:t>
-      </w:r>
-    </w:p>
-    <w:p>
-      <w:pPr>
-        <w:pStyle w:val="Choice"/>
-      </w:pPr>
-      <w:r>
-        <w:t>b)</w:t>
-        <w:tab/>
-        <w:t>Si, premendo 1 e 3</w:t>
-      </w:r>
-    </w:p>
-    <w:p>
-      <w:pPr>
-        <w:pStyle w:val="Choice"/>
-      </w:pPr>
-      <w:r>
-        <w:t>c)</w:t>
-        <w:tab/>
-        <w:t>Si,premendo 1 e 2</w:t>
       </w:r>
     </w:p>
     <w:p>

</xml_diff>